<commit_message>
Upstream-Prüfung (testakten): Nachtrag Klotzkette 9a79db7 vom 23.10.2026
15 neue Upstream-Commits seit 13434d6, nur Gruppe 'testakten'. Nicht ohne Freigabe mergen.

Co-Authored-By: Claude Opus 5.5 (1M context) <noreply@anthropic.com>
Claude-Session: https://claude.ai/code/session_01Y69mKztTWrrZa9bLHJLnSd
</commit_message>
<xml_diff>
--- a/testakten/insolvenzverwaltung-moebelwerk-havelberg-regelverfahren/17_schlussbericht.docx
+++ b/testakten/insolvenzverwaltung-moebelwerk-havelberg-regelverfahren/17_schlussbericht.docx
@@ -4,198 +4,65 @@
   <w:body>
     <w:p>
       <w:pPr>
-        <w:spacing w:after="160" w:line="259" w:lineRule="auto"/>
-        <w:jc w:val="right"/>
+        <w:pStyle w:val="Title"/>
+        <w:jc w:val="center"/>
       </w:pPr>
       <w:r>
-        <w:rPr>
-          <w:rFonts w:ascii="Times New Roman" w:hAnsi="Times New Roman"/>
-          <w:b/>
-          <w:sz w:val="28"/>
-        </w:rPr>
-        <w:t>Magdeburg, 20. Januar 2027</w:t>
+        <w:t>Schlussbericht und Schlussrechnung</w:t>
       </w:r>
     </w:p>
     <w:p>
       <w:pPr>
-        <w:spacing w:line="259" w:lineRule="auto" w:after="60"/>
-      </w:pPr>
-    </w:p>
-    <w:p>
-      <w:pPr>
-        <w:spacing w:before="120" w:after="60" w:line="259" w:lineRule="auto"/>
+        <w:jc w:val="center"/>
       </w:pPr>
       <w:r>
         <w:rPr>
-          <w:rFonts w:ascii="Times New Roman" w:hAnsi="Times New Roman"/>
           <w:b/>
-          <w:sz w:val="22"/>
         </w:rPr>
-        <w:t>Dr. Nora Westphal</w:t>
-      </w:r>
-    </w:p>
-    <w:p>
-      <w:pPr>
-        <w:spacing w:before="120" w:after="60" w:line="259" w:lineRule="auto"/>
-      </w:pPr>
-      <w:r>
-        <w:rPr>
-          <w:rFonts w:ascii="Times New Roman" w:hAnsi="Times New Roman"/>
-          <w:b/>
-          <w:sz w:val="22"/>
-        </w:rPr>
-        <w:t>Rechtsanwältin | Insolvenzverwalterin</w:t>
-      </w:r>
-    </w:p>
-    <w:p>
-      <w:pPr>
-        <w:spacing w:before="120" w:after="60" w:line="259" w:lineRule="auto"/>
-      </w:pPr>
-      <w:r>
-        <w:rPr>
-          <w:rFonts w:ascii="Times New Roman" w:hAnsi="Times New Roman"/>
-          <w:b/>
-          <w:sz w:val="22"/>
-        </w:rPr>
-        <w:t>Kurfürstenallee 88, 39104 Magdeburg</w:t>
-      </w:r>
-    </w:p>
-    <w:p>
-      <w:pPr>
-        <w:spacing w:line="259" w:lineRule="auto" w:after="60"/>
-      </w:pPr>
-    </w:p>
-    <w:p>
-      <w:pPr>
-        <w:spacing w:before="120" w:after="60" w:line="259" w:lineRule="auto"/>
-        <w:jc w:val="both"/>
-      </w:pPr>
-      <w:r>
-        <w:rPr>
-          <w:rFonts w:ascii="Times New Roman" w:hAnsi="Times New Roman"/>
-          <w:b/>
-          <w:sz w:val="22"/>
-        </w:rPr>
-        <w:t>An das</w:t>
-      </w:r>
-    </w:p>
-    <w:p>
-      <w:pPr>
-        <w:spacing w:before="120" w:after="60" w:line="259" w:lineRule="auto"/>
-        <w:jc w:val="both"/>
-      </w:pPr>
-      <w:r>
-        <w:rPr>
-          <w:rFonts w:ascii="Times New Roman" w:hAnsi="Times New Roman"/>
-          <w:b/>
-          <w:sz w:val="22"/>
-        </w:rPr>
-        <w:t>Amtsgericht Stendal – Insolvenzgericht –</w:t>
-      </w:r>
-    </w:p>
-    <w:p>
-      <w:pPr>
-        <w:spacing w:line="259" w:lineRule="auto" w:after="60"/>
-        <w:jc w:val="both"/>
-      </w:pPr>
-      <w:r>
-        <w:rPr>
-          <w:rFonts w:ascii="Calibri" w:hAnsi="Calibri"/>
-          <w:b w:val="0"/>
-          <w:sz w:val="22"/>
-        </w:rPr>
-        <w:t>39576 Stendal</w:t>
-      </w:r>
-    </w:p>
-    <w:p>
-      <w:pPr>
-        <w:spacing w:line="259" w:lineRule="auto" w:after="60"/>
-      </w:pPr>
-    </w:p>
-    <w:p>
-      <w:pPr>
-        <w:spacing w:line="259" w:lineRule="auto" w:after="60"/>
-        <w:jc w:val="left"/>
-      </w:pPr>
-      <w:r>
-        <w:rPr>
-          <w:rFonts w:ascii="Calibri" w:hAnsi="Calibri"/>
-          <w:b/>
-          <w:sz w:val="30"/>
-        </w:rPr>
-        <w:t>SCHLUSSBERICHT – Az. 7 IN 41/26</w:t>
-      </w:r>
-    </w:p>
-    <w:p>
-      <w:pPr>
-        <w:spacing w:line="259" w:lineRule="auto" w:after="60"/>
-        <w:jc w:val="left"/>
-      </w:pPr>
-      <w:r>
-        <w:rPr>
-          <w:rFonts w:ascii="Calibri" w:hAnsi="Calibri"/>
-          <w:b/>
-          <w:sz w:val="24"/>
-        </w:rPr>
-        <w:t>Insolvenzverfahren über das Vermögen der Möbelwerk Havelberg GmbH</w:t>
-      </w:r>
-    </w:p>
-    <w:p>
-      <w:pPr>
-        <w:spacing w:line="259" w:lineRule="auto" w:after="60"/>
-      </w:pPr>
-    </w:p>
-    <w:p>
-      <w:pPr>
-        <w:spacing w:line="259" w:lineRule="auto" w:after="60"/>
-        <w:jc w:val="left"/>
-      </w:pPr>
-      <w:r>
-        <w:rPr>
-          <w:rFonts w:ascii="Calibri" w:hAnsi="Calibri"/>
-          <w:b/>
-          <w:sz w:val="24"/>
-        </w:rPr>
-        <w:t>I. Verfahrenseckdaten</w:t>
+        <w:t>Möbelwerk Havelberg GmbH – AG Stendal 7 IN 41/26</w:t>
       </w:r>
     </w:p>
     <w:tbl>
       <w:tblPr>
         <w:tblStyle w:val="TableGrid"/>
         <w:tblW w:type="auto" w:w="0"/>
+        <w:jc w:val="center"/>
         <w:tblLook w:firstColumn="1" w:firstRow="1" w:lastColumn="0" w:lastRow="0" w:noHBand="0" w:noVBand="1" w:val="04A0"/>
       </w:tblPr>
       <w:tblGrid>
-        <w:gridCol w:w="4394"/>
-        <w:gridCol w:w="4394"/>
+        <w:gridCol w:w="4872"/>
+        <w:gridCol w:w="4872"/>
       </w:tblGrid>
       <w:tr>
         <w:tc>
           <w:tcPr>
-            <w:tcW w:type="dxa" w:w="4394"/>
+            <w:tcW w:type="dxa" w:w="2835"/>
+            <w:shd w:fill="D9EAF7"/>
           </w:tcPr>
           <w:p>
             <w:r>
               <w:rPr>
-                <w:rFonts w:ascii="Calibri" w:hAnsi="Calibri"/>
+                <w:rFonts w:ascii="Times New Roman" w:hAnsi="Times New Roman"/>
                 <w:b/>
                 <w:sz w:val="20"/>
               </w:rPr>
-              <w:t>Schuldnerin</w:t>
+              <w:t>Verfahrensangabe</w:t>
             </w:r>
           </w:p>
         </w:tc>
         <w:tc>
           <w:tcPr>
-            <w:tcW w:type="dxa" w:w="4394"/>
+            <w:tcW w:type="dxa" w:w="6236"/>
+            <w:shd w:fill="D9EAF7"/>
           </w:tcPr>
           <w:p>
             <w:r>
               <w:rPr>
-                <w:rFonts w:ascii="Calibri" w:hAnsi="Calibri"/>
+                <w:rFonts w:ascii="Times New Roman" w:hAnsi="Times New Roman"/>
+                <w:b/>
                 <w:sz w:val="20"/>
               </w:rPr>
-              <w:t>Möbelwerk Havelberg GmbH, Werftstraße 14, 39539 Havelberg</w:t>
+              <w:t>Wert</w:t>
             </w:r>
           </w:p>
         </w:tc>
@@ -203,14 +70,46 @@
       <w:tr>
         <w:tc>
           <w:tcPr>
-            <w:tcW w:type="dxa" w:w="4394"/>
+            <w:tcW w:type="dxa" w:w="2835"/>
+            <w:vAlign w:val="top"/>
           </w:tcPr>
           <w:p>
             <w:r>
               <w:rPr>
-                <w:rFonts w:ascii="Calibri" w:hAnsi="Calibri"/>
-                <w:b/>
-                <w:sz w:val="20"/>
+                <w:rFonts w:ascii="Times New Roman" w:hAnsi="Times New Roman"/>
+                <w:sz w:val="18"/>
+              </w:rPr>
+              <w:t>Insolvenzgericht</w:t>
+            </w:r>
+          </w:p>
+        </w:tc>
+        <w:tc>
+          <w:tcPr>
+            <w:tcW w:type="dxa" w:w="6236"/>
+            <w:vAlign w:val="top"/>
+          </w:tcPr>
+          <w:p>
+            <w:r>
+              <w:rPr>
+                <w:rFonts w:ascii="Times New Roman" w:hAnsi="Times New Roman"/>
+                <w:sz w:val="18"/>
+              </w:rPr>
+              <w:t>Amtsgericht Stendal</w:t>
+            </w:r>
+          </w:p>
+        </w:tc>
+      </w:tr>
+      <w:tr>
+        <w:tc>
+          <w:tcPr>
+            <w:tcW w:type="dxa" w:w="2835"/>
+            <w:vAlign w:val="top"/>
+          </w:tcPr>
+          <w:p>
+            <w:r>
+              <w:rPr>
+                <w:rFonts w:ascii="Times New Roman" w:hAnsi="Times New Roman"/>
+                <w:sz w:val="18"/>
               </w:rPr>
               <w:t>Aktenzeichen</w:t>
             </w:r>
@@ -218,13 +117,14 @@
         </w:tc>
         <w:tc>
           <w:tcPr>
-            <w:tcW w:type="dxa" w:w="4394"/>
+            <w:tcW w:type="dxa" w:w="6236"/>
+            <w:vAlign w:val="top"/>
           </w:tcPr>
           <w:p>
             <w:r>
               <w:rPr>
-                <w:rFonts w:ascii="Calibri" w:hAnsi="Calibri"/>
-                <w:sz w:val="20"/>
+                <w:rFonts w:ascii="Times New Roman" w:hAnsi="Times New Roman"/>
+                <w:sz w:val="18"/>
               </w:rPr>
               <w:t>7 IN 41/26</w:t>
             </w:r>
@@ -234,30 +134,31 @@
       <w:tr>
         <w:tc>
           <w:tcPr>
-            <w:tcW w:type="dxa" w:w="4394"/>
+            <w:tcW w:type="dxa" w:w="2835"/>
+            <w:vAlign w:val="top"/>
           </w:tcPr>
           <w:p>
             <w:r>
               <w:rPr>
-                <w:rFonts w:ascii="Calibri" w:hAnsi="Calibri"/>
-                <w:b/>
-                <w:sz w:val="20"/>
+                <w:rFonts w:ascii="Times New Roman" w:hAnsi="Times New Roman"/>
+                <w:sz w:val="18"/>
               </w:rPr>
-              <w:t>Eröffnungsdatum</w:t>
+              <w:t>Schuldnerin</w:t>
             </w:r>
           </w:p>
         </w:tc>
         <w:tc>
           <w:tcPr>
-            <w:tcW w:type="dxa" w:w="4394"/>
+            <w:tcW w:type="dxa" w:w="6236"/>
+            <w:vAlign w:val="top"/>
           </w:tcPr>
           <w:p>
             <w:r>
               <w:rPr>
-                <w:rFonts w:ascii="Calibri" w:hAnsi="Calibri"/>
-                <w:sz w:val="20"/>
+                <w:rFonts w:ascii="Times New Roman" w:hAnsi="Times New Roman"/>
+                <w:sz w:val="18"/>
               </w:rPr>
-              <w:t>12.06.2026</w:t>
+              <w:t>Möbelwerk Havelberg GmbH</w:t>
             </w:r>
           </w:p>
         </w:tc>
@@ -265,30 +166,31 @@
       <w:tr>
         <w:tc>
           <w:tcPr>
-            <w:tcW w:type="dxa" w:w="4394"/>
+            <w:tcW w:type="dxa" w:w="2835"/>
+            <w:vAlign w:val="top"/>
           </w:tcPr>
           <w:p>
             <w:r>
               <w:rPr>
-                <w:rFonts w:ascii="Calibri" w:hAnsi="Calibri"/>
-                <w:b/>
-                <w:sz w:val="20"/>
+                <w:rFonts w:ascii="Times New Roman" w:hAnsi="Times New Roman"/>
+                <w:sz w:val="18"/>
               </w:rPr>
-              <w:t>Insolvenzverwalterin</w:t>
+              <w:t>Insolvenzverwaltung</w:t>
             </w:r>
           </w:p>
         </w:tc>
         <w:tc>
           <w:tcPr>
-            <w:tcW w:type="dxa" w:w="4394"/>
+            <w:tcW w:type="dxa" w:w="6236"/>
+            <w:vAlign w:val="top"/>
           </w:tcPr>
           <w:p>
             <w:r>
               <w:rPr>
-                <w:rFonts w:ascii="Calibri" w:hAnsi="Calibri"/>
-                <w:sz w:val="20"/>
+                <w:rFonts w:ascii="Times New Roman" w:hAnsi="Times New Roman"/>
+                <w:sz w:val="18"/>
               </w:rPr>
-              <w:t>Dr. Nora Westphal, Magdeburg</w:t>
+              <w:t>Dr. Nora Westphal</w:t>
             </w:r>
           </w:p>
         </w:tc>
@@ -296,30 +198,31 @@
       <w:tr>
         <w:tc>
           <w:tcPr>
-            <w:tcW w:type="dxa" w:w="4394"/>
+            <w:tcW w:type="dxa" w:w="2835"/>
+            <w:vAlign w:val="top"/>
           </w:tcPr>
           <w:p>
             <w:r>
               <w:rPr>
-                <w:rFonts w:ascii="Calibri" w:hAnsi="Calibri"/>
-                <w:b/>
-                <w:sz w:val="20"/>
+                <w:rFonts w:ascii="Times New Roman" w:hAnsi="Times New Roman"/>
+                <w:sz w:val="18"/>
               </w:rPr>
-              <w:t>Eröffnungsgrund</w:t>
+              <w:t>Datum</w:t>
             </w:r>
           </w:p>
         </w:tc>
         <w:tc>
           <w:tcPr>
-            <w:tcW w:type="dxa" w:w="4394"/>
+            <w:tcW w:type="dxa" w:w="6236"/>
+            <w:vAlign w:val="top"/>
           </w:tcPr>
           <w:p>
             <w:r>
               <w:rPr>
-                <w:rFonts w:ascii="Calibri" w:hAnsi="Calibri"/>
-                <w:sz w:val="20"/>
+                <w:rFonts w:ascii="Times New Roman" w:hAnsi="Times New Roman"/>
+                <w:sz w:val="18"/>
               </w:rPr>
-              <w:t>Zahlungsunfähigkeit (§ 17 InsO)</w:t>
+              <w:t>20. Januar 2027</w:t>
             </w:r>
           </w:p>
         </w:tc>
@@ -327,152 +230,100 @@
       <w:tr>
         <w:tc>
           <w:tcPr>
-            <w:tcW w:type="dxa" w:w="4394"/>
+            <w:tcW w:type="dxa" w:w="2835"/>
+            <w:vAlign w:val="top"/>
           </w:tcPr>
           <w:p>
             <w:r>
               <w:rPr>
-                <w:rFonts w:ascii="Calibri" w:hAnsi="Calibri"/>
-                <w:b/>
-                <w:sz w:val="20"/>
+                <w:rFonts w:ascii="Times New Roman" w:hAnsi="Times New Roman"/>
+                <w:sz w:val="18"/>
               </w:rPr>
-              <w:t>Prüfungstermin</w:t>
+              <w:t>Gegenstand</w:t>
             </w:r>
           </w:p>
         </w:tc>
         <w:tc>
           <w:tcPr>
-            <w:tcW w:type="dxa" w:w="4394"/>
+            <w:tcW w:type="dxa" w:w="6236"/>
+            <w:vAlign w:val="top"/>
           </w:tcPr>
           <w:p>
             <w:r>
               <w:rPr>
-                <w:rFonts w:ascii="Calibri" w:hAnsi="Calibri"/>
-                <w:sz w:val="20"/>
+                <w:rFonts w:ascii="Times New Roman" w:hAnsi="Times New Roman"/>
+                <w:sz w:val="18"/>
               </w:rPr>
-              <w:t>14.09.2026</w:t>
-            </w:r>
-          </w:p>
-        </w:tc>
-      </w:tr>
-      <w:tr>
-        <w:tc>
-          <w:tcPr>
-            <w:tcW w:type="dxa" w:w="4394"/>
-          </w:tcPr>
-          <w:p>
-            <w:r>
-              <w:rPr>
-                <w:rFonts w:ascii="Calibri" w:hAnsi="Calibri"/>
-                <w:b/>
-                <w:sz w:val="20"/>
-              </w:rPr>
-              <w:t>Schlusstermin (beantragt)</w:t>
-            </w:r>
-          </w:p>
-        </w:tc>
-        <w:tc>
-          <w:tcPr>
-            <w:tcW w:type="dxa" w:w="4394"/>
-          </w:tcPr>
-          <w:p>
-            <w:r>
-              <w:rPr>
-                <w:rFonts w:ascii="Calibri" w:hAnsi="Calibri"/>
-                <w:sz w:val="20"/>
-              </w:rPr>
-              <w:t>15.02.2027</w:t>
-            </w:r>
-          </w:p>
-        </w:tc>
-      </w:tr>
-      <w:tr>
-        <w:tc>
-          <w:tcPr>
-            <w:tcW w:type="dxa" w:w="4394"/>
-          </w:tcPr>
-          <w:p>
-            <w:r>
-              <w:rPr>
-                <w:rFonts w:ascii="Calibri" w:hAnsi="Calibri"/>
-                <w:b/>
-                <w:sz w:val="20"/>
-              </w:rPr>
-              <w:t>Verfahrensdauer</w:t>
-            </w:r>
-          </w:p>
-        </w:tc>
-        <w:tc>
-          <w:tcPr>
-            <w:tcW w:type="dxa" w:w="4394"/>
-          </w:tcPr>
-          <w:p>
-            <w:r>
-              <w:rPr>
-                <w:rFonts w:ascii="Calibri" w:hAnsi="Calibri"/>
-                <w:sz w:val="20"/>
-              </w:rPr>
-              <w:t>ca. 8,5 Monate</w:t>
+              <w:t>Abschlussbericht, Schlussrechnung und Verteilungsvorschlag</w:t>
             </w:r>
           </w:p>
         </w:tc>
       </w:tr>
     </w:tbl>
+    <w:p/>
     <w:p>
       <w:pPr>
-        <w:spacing w:line="259" w:lineRule="auto" w:after="60"/>
-      </w:pPr>
-    </w:p>
-    <w:p>
-      <w:pPr>
-        <w:spacing w:line="259" w:lineRule="auto" w:after="60"/>
-        <w:jc w:val="left"/>
+        <w:pStyle w:val="Heading1"/>
       </w:pPr>
       <w:r>
-        <w:rPr>
-          <w:rFonts w:ascii="Calibri" w:hAnsi="Calibri"/>
-          <w:b/>
-          <w:sz w:val="24"/>
-        </w:rPr>
-        <w:t>II. Schlussrechnung</w:t>
+        <w:t>1. Verfahren und Abschlussstichtag</w:t>
       </w:r>
     </w:p>
     <w:p>
       <w:pPr>
-        <w:spacing w:line="259" w:lineRule="auto" w:after="60"/>
-        <w:jc w:val="both"/>
+        <w:spacing w:after="120"/>
       </w:pPr>
       <w:r>
-        <w:rPr>
-          <w:rFonts w:ascii="Calibri" w:hAnsi="Calibri"/>
-          <w:b/>
-          <w:sz w:val="22"/>
-        </w:rPr>
-        <w:t>Einnahmen:</w:t>
+        <w:t>Die Furnier Nord GmbH stellte am 4. Mai 2026 Insolvenzantrag. Das Amtsgericht Stendal ordnete am 6. Mai 2026 Sicherungsmaßnahmen an und eröffnete das Verfahren am 12. Juni 2026. Der Betrieb wurde zur Fertigstellung zweier Aufträge kurzzeitig fortgeführt und danach stillgelegt. Dieser Bericht bildet den Stand vom 20. Januar 2027 ab.</w:t>
+      </w:r>
+    </w:p>
+    <w:p>
+      <w:pPr>
+        <w:pStyle w:val="Heading1"/>
+      </w:pPr>
+      <w:r>
+        <w:t>2. Betriebsfortführung und Personal</w:t>
+      </w:r>
+    </w:p>
+    <w:p>
+      <w:pPr>
+        <w:spacing w:after="120"/>
+      </w:pPr>
+      <w:r>
+        <w:t>Die zeitlich begrenzte Fortführung diente der Fertigstellung der Aufträge Pflegeheim Elbaue und Hotel Speicherstadt. Erlöse und Fortführungskosten sind in der Rechnungslegung getrennt erfasst. Die Insolvenzgeldvorfinanzierung und ihre Rückführung sind durch die Sammelabrechnung belegt. Offene Arbeitnehmeransprüche wurden im Prüfungstermin behandelt und in der Tabelle nach ihrem festgestellten Stand geführt.</w:t>
+      </w:r>
+    </w:p>
+    <w:p>
+      <w:pPr>
+        <w:pStyle w:val="Heading1"/>
+      </w:pPr>
+      <w:r>
+        <w:t>3. Verwertung und Drittrechte</w:t>
       </w:r>
     </w:p>
     <w:tbl>
       <w:tblPr>
         <w:tblStyle w:val="TableGrid"/>
         <w:tblW w:type="auto" w:w="0"/>
+        <w:jc w:val="center"/>
         <w:tblLook w:firstColumn="1" w:firstRow="1" w:lastColumn="0" w:lastRow="0" w:noHBand="0" w:noVBand="1" w:val="04A0"/>
       </w:tblPr>
       <w:tblGrid>
-        <w:gridCol w:w="4394"/>
-        <w:gridCol w:w="4394"/>
+        <w:gridCol w:w="3248"/>
+        <w:gridCol w:w="3248"/>
+        <w:gridCol w:w="3248"/>
       </w:tblGrid>
       <w:tr>
         <w:tc>
           <w:tcPr>
-            <w:tcW w:type="dxa" w:w="4394"/>
-            <w:shd w:val="clear" w:color="auto" w:fill="2E75B6"/>
+            <w:tcW w:type="dxa" w:w="3248"/>
+            <w:shd w:fill="D9EAF7"/>
           </w:tcPr>
           <w:p>
             <w:r>
               <w:rPr>
-                <w:rFonts w:ascii="Calibri" w:hAnsi="Calibri"/>
+                <w:rFonts w:ascii="Times New Roman" w:hAnsi="Times New Roman"/>
                 <w:b/>
-                <w:color w:val="FFFFFF"/>
                 <w:sz w:val="20"/>
               </w:rPr>
               <w:t>Position</w:t>
@@ -481,18 +332,33 @@
         </w:tc>
         <w:tc>
           <w:tcPr>
-            <w:tcW w:type="dxa" w:w="4394"/>
-            <w:shd w:val="clear" w:color="auto" w:fill="2E75B6"/>
+            <w:tcW w:type="dxa" w:w="3248"/>
+            <w:shd w:fill="D9EAF7"/>
           </w:tcPr>
           <w:p>
             <w:r>
               <w:rPr>
-                <w:rFonts w:ascii="Calibri" w:hAnsi="Calibri"/>
+                <w:rFonts w:ascii="Times New Roman" w:hAnsi="Times New Roman"/>
                 <w:b/>
-                <w:color w:val="FFFFFF"/>
                 <w:sz w:val="20"/>
               </w:rPr>
-              <w:t>Betrag (EUR)</w:t>
+              <w:t>Bruttozufluss oder Ergebnis</w:t>
+            </w:r>
+          </w:p>
+        </w:tc>
+        <w:tc>
+          <w:tcPr>
+            <w:tcW w:type="dxa" w:w="3248"/>
+            <w:shd w:fill="D9EAF7"/>
+          </w:tcPr>
+          <w:p>
+            <w:r>
+              <w:rPr>
+                <w:rFonts w:ascii="Times New Roman" w:hAnsi="Times New Roman"/>
+                <w:b/>
+                <w:sz w:val="20"/>
+              </w:rPr>
+              <w:t>Behandlung</w:t>
             </w:r>
           </w:p>
         </w:tc>
@@ -500,29 +366,46 @@
       <w:tr>
         <w:tc>
           <w:tcPr>
-            <w:tcW w:type="dxa" w:w="4394"/>
+            <w:tcW w:type="dxa" w:w="3248"/>
+            <w:vAlign w:val="top"/>
           </w:tcPr>
           <w:p>
             <w:r>
               <w:rPr>
-                <w:rFonts w:ascii="Calibri" w:hAnsi="Calibri"/>
-                <w:sz w:val="20"/>
+                <w:rFonts w:ascii="Times New Roman" w:hAnsi="Times New Roman"/>
+                <w:sz w:val="18"/>
               </w:rPr>
-              <w:t>Bankguthaben bei Eröffnung</w:t>
+              <w:t>Maschinen und Sicherungsgut</w:t>
             </w:r>
           </w:p>
         </w:tc>
         <w:tc>
           <w:tcPr>
-            <w:tcW w:type="dxa" w:w="4394"/>
+            <w:tcW w:type="dxa" w:w="3248"/>
+            <w:vAlign w:val="top"/>
           </w:tcPr>
           <w:p>
             <w:r>
               <w:rPr>
-                <w:rFonts w:ascii="Calibri" w:hAnsi="Calibri"/>
-                <w:sz w:val="20"/>
+                <w:rFonts w:ascii="Times New Roman" w:hAnsi="Times New Roman"/>
+                <w:sz w:val="18"/>
               </w:rPr>
-              <w:t>20.890,00</w:t>
+              <w:t>343.500,00 EUR</w:t>
+            </w:r>
+          </w:p>
+        </w:tc>
+        <w:tc>
+          <w:tcPr>
+            <w:tcW w:type="dxa" w:w="3248"/>
+            <w:vAlign w:val="top"/>
+          </w:tcPr>
+          <w:p>
+            <w:r>
+              <w:rPr>
+                <w:rFonts w:ascii="Times New Roman" w:hAnsi="Times New Roman"/>
+                <w:sz w:val="18"/>
+              </w:rPr>
+              <w:t>gesondertes Sicherheitenkonto; vollständig an Havelbank ausgekehrt</w:t>
             </w:r>
           </w:p>
         </w:tc>
@@ -530,29 +413,46 @@
       <w:tr>
         <w:tc>
           <w:tcPr>
-            <w:tcW w:type="dxa" w:w="4394"/>
+            <w:tcW w:type="dxa" w:w="3248"/>
+            <w:vAlign w:val="top"/>
           </w:tcPr>
           <w:p>
             <w:r>
               <w:rPr>
-                <w:rFonts w:ascii="Calibri" w:hAnsi="Calibri"/>
-                <w:sz w:val="20"/>
+                <w:rFonts w:ascii="Times New Roman" w:hAnsi="Times New Roman"/>
+                <w:sz w:val="18"/>
               </w:rPr>
-              <w:t>Barkasse</w:t>
+              <w:t>Freie Verwertung und Forderungseinzug</w:t>
             </w:r>
           </w:p>
         </w:tc>
         <w:tc>
           <w:tcPr>
-            <w:tcW w:type="dxa" w:w="4394"/>
+            <w:tcW w:type="dxa" w:w="3248"/>
+            <w:vAlign w:val="top"/>
           </w:tcPr>
           <w:p>
             <w:r>
               <w:rPr>
-                <w:rFonts w:ascii="Calibri" w:hAnsi="Calibri"/>
-                <w:sz w:val="20"/>
+                <w:rFonts w:ascii="Times New Roman" w:hAnsi="Times New Roman"/>
+                <w:sz w:val="18"/>
               </w:rPr>
-              <w:t>1.240,00</w:t>
+              <w:t>428.630,00 EUR</w:t>
+            </w:r>
+          </w:p>
+        </w:tc>
+        <w:tc>
+          <w:tcPr>
+            <w:tcW w:type="dxa" w:w="3248"/>
+            <w:vAlign w:val="top"/>
+          </w:tcPr>
+          <w:p>
+            <w:r>
+              <w:rPr>
+                <w:rFonts w:ascii="Times New Roman" w:hAnsi="Times New Roman"/>
+                <w:sz w:val="18"/>
+              </w:rPr>
+              <w:t>freie Masse</w:t>
             </w:r>
           </w:p>
         </w:tc>
@@ -560,29 +460,46 @@
       <w:tr>
         <w:tc>
           <w:tcPr>
-            <w:tcW w:type="dxa" w:w="4394"/>
+            <w:tcW w:type="dxa" w:w="3248"/>
+            <w:vAlign w:val="top"/>
           </w:tcPr>
           <w:p>
             <w:r>
               <w:rPr>
-                <w:rFonts w:ascii="Calibri" w:hAnsi="Calibri"/>
-                <w:sz w:val="20"/>
+                <w:rFonts w:ascii="Times New Roman" w:hAnsi="Times New Roman"/>
+                <w:sz w:val="18"/>
               </w:rPr>
-              <w:t>Fortführungserlöse netto</w:t>
+              <w:t>D&amp;O-Vergleich</w:t>
             </w:r>
           </w:p>
         </w:tc>
         <w:tc>
           <w:tcPr>
-            <w:tcW w:type="dxa" w:w="4394"/>
+            <w:tcW w:type="dxa" w:w="3248"/>
+            <w:vAlign w:val="top"/>
           </w:tcPr>
           <w:p>
             <w:r>
               <w:rPr>
-                <w:rFonts w:ascii="Calibri" w:hAnsi="Calibri"/>
-                <w:sz w:val="20"/>
+                <w:rFonts w:ascii="Times New Roman" w:hAnsi="Times New Roman"/>
+                <w:sz w:val="18"/>
               </w:rPr>
-              <w:t>47.700,00</w:t>
+              <w:t>115.000,00 EUR</w:t>
+            </w:r>
+          </w:p>
+        </w:tc>
+        <w:tc>
+          <w:tcPr>
+            <w:tcW w:type="dxa" w:w="3248"/>
+            <w:vAlign w:val="top"/>
+          </w:tcPr>
+          <w:p>
+            <w:r>
+              <w:rPr>
+                <w:rFonts w:ascii="Times New Roman" w:hAnsi="Times New Roman"/>
+                <w:sz w:val="18"/>
+              </w:rPr>
+              <w:t>freie Masse; Vergleich erledigt</w:t>
             </w:r>
           </w:p>
         </w:tc>
@@ -590,29 +507,46 @@
       <w:tr>
         <w:tc>
           <w:tcPr>
-            <w:tcW w:type="dxa" w:w="4394"/>
+            <w:tcW w:type="dxa" w:w="3248"/>
+            <w:vAlign w:val="top"/>
           </w:tcPr>
           <w:p>
             <w:r>
               <w:rPr>
-                <w:rFonts w:ascii="Calibri" w:hAnsi="Calibri"/>
-                <w:sz w:val="20"/>
+                <w:rFonts w:ascii="Times New Roman" w:hAnsi="Times New Roman"/>
+                <w:sz w:val="18"/>
               </w:rPr>
-              <w:t>Maschinenverwertung EML GmbH</w:t>
+              <w:t>Anfechtungsvergleiche</w:t>
             </w:r>
           </w:p>
         </w:tc>
         <w:tc>
           <w:tcPr>
-            <w:tcW w:type="dxa" w:w="4394"/>
+            <w:tcW w:type="dxa" w:w="3248"/>
+            <w:vAlign w:val="top"/>
           </w:tcPr>
           <w:p>
             <w:r>
               <w:rPr>
-                <w:rFonts w:ascii="Calibri" w:hAnsi="Calibri"/>
-                <w:sz w:val="20"/>
+                <w:rFonts w:ascii="Times New Roman" w:hAnsi="Times New Roman"/>
+                <w:sz w:val="18"/>
               </w:rPr>
-              <w:t>237.000,00</w:t>
+              <w:t>41.000,00 EUR</w:t>
+            </w:r>
+          </w:p>
+        </w:tc>
+        <w:tc>
+          <w:tcPr>
+            <w:tcW w:type="dxa" w:w="3248"/>
+            <w:vAlign w:val="top"/>
+          </w:tcPr>
+          <w:p>
+            <w:r>
+              <w:rPr>
+                <w:rFonts w:ascii="Times New Roman" w:hAnsi="Times New Roman"/>
+                <w:sz w:val="18"/>
+              </w:rPr>
+              <w:t>freie Masse; vollständig bezahlt</w:t>
             </w:r>
           </w:p>
         </w:tc>
@@ -620,29 +554,46 @@
       <w:tr>
         <w:tc>
           <w:tcPr>
-            <w:tcW w:type="dxa" w:w="4394"/>
+            <w:tcW w:type="dxa" w:w="3248"/>
+            <w:vAlign w:val="top"/>
           </w:tcPr>
           <w:p>
             <w:r>
               <w:rPr>
-                <w:rFonts w:ascii="Calibri" w:hAnsi="Calibri"/>
-                <w:sz w:val="20"/>
+                <w:rFonts w:ascii="Times New Roman" w:hAnsi="Times New Roman"/>
+                <w:sz w:val="18"/>
               </w:rPr>
-              <w:t>Online-Auktion Büro/IT</w:t>
+              <w:t>Steuererstattung</w:t>
             </w:r>
           </w:p>
         </w:tc>
         <w:tc>
           <w:tcPr>
-            <w:tcW w:type="dxa" w:w="4394"/>
+            <w:tcW w:type="dxa" w:w="3248"/>
+            <w:vAlign w:val="top"/>
           </w:tcPr>
           <w:p>
             <w:r>
               <w:rPr>
-                <w:rFonts w:ascii="Calibri" w:hAnsi="Calibri"/>
-                <w:sz w:val="20"/>
+                <w:rFonts w:ascii="Times New Roman" w:hAnsi="Times New Roman"/>
+                <w:sz w:val="18"/>
               </w:rPr>
-              <w:t>18.400,00</w:t>
+              <w:t>14.200,00 EUR</w:t>
+            </w:r>
+          </w:p>
+        </w:tc>
+        <w:tc>
+          <w:tcPr>
+            <w:tcW w:type="dxa" w:w="3248"/>
+            <w:vAlign w:val="top"/>
+          </w:tcPr>
+          <w:p>
+            <w:r>
+              <w:rPr>
+                <w:rFonts w:ascii="Times New Roman" w:hAnsi="Times New Roman"/>
+                <w:sz w:val="18"/>
+              </w:rPr>
+              <w:t>eingegangen und gebucht</w:t>
             </w:r>
           </w:p>
         </w:tc>
@@ -650,29 +601,143 @@
       <w:tr>
         <w:tc>
           <w:tcPr>
-            <w:tcW w:type="dxa" w:w="4394"/>
+            <w:tcW w:type="dxa" w:w="3248"/>
+            <w:vAlign w:val="top"/>
           </w:tcPr>
           <w:p>
             <w:r>
               <w:rPr>
-                <w:rFonts w:ascii="Calibri" w:hAnsi="Calibri"/>
-                <w:sz w:val="20"/>
+                <w:rFonts w:ascii="Times New Roman" w:hAnsi="Times New Roman"/>
+                <w:sz w:val="18"/>
               </w:rPr>
-              <w:t>Lackierkabine Auktionshaus</w:t>
+              <w:t>Sonstige freie Zuflüsse</w:t>
             </w:r>
           </w:p>
         </w:tc>
         <w:tc>
           <w:tcPr>
-            <w:tcW w:type="dxa" w:w="4394"/>
+            <w:tcW w:type="dxa" w:w="3248"/>
+            <w:vAlign w:val="top"/>
           </w:tcPr>
           <w:p>
             <w:r>
               <w:rPr>
-                <w:rFonts w:ascii="Calibri" w:hAnsi="Calibri"/>
+                <w:rFonts w:ascii="Times New Roman" w:hAnsi="Times New Roman"/>
+                <w:sz w:val="18"/>
+              </w:rPr>
+              <w:t>179.000,00 EUR</w:t>
+            </w:r>
+          </w:p>
+        </w:tc>
+        <w:tc>
+          <w:tcPr>
+            <w:tcW w:type="dxa" w:w="3248"/>
+            <w:vAlign w:val="top"/>
+          </w:tcPr>
+          <w:p>
+            <w:r>
+              <w:rPr>
+                <w:rFonts w:ascii="Times New Roman" w:hAnsi="Times New Roman"/>
+                <w:sz w:val="18"/>
+              </w:rPr>
+              <w:t>Fortführung, Kaution und weitere Positionen</w:t>
+            </w:r>
+          </w:p>
+        </w:tc>
+      </w:tr>
+    </w:tbl>
+    <w:p/>
+    <w:p>
+      <w:pPr>
+        <w:spacing w:after="120"/>
+      </w:pPr>
+      <w:r>
+        <w:t>Die gesicherte Forderung der Havelbank eG wurde zum Abschluss mit 480.000,00 EUR festgestellt. Auf sie wurden 343.500,00 EUR aus dem Sicherungsgut ausgekehrt. Der verbleibende Ausfall von 136.500,00 EUR ist in der Forderungsbasis nach § 38 InsO enthalten. Eine Doppelberücksichtigung findet nicht statt.</w:t>
+      </w:r>
+    </w:p>
+    <w:p>
+      <w:pPr>
+        <w:pStyle w:val="Heading1"/>
+      </w:pPr>
+      <w:r>
+        <w:t>4. Schlussrechnung und Kontenabgleich</w:t>
+      </w:r>
+    </w:p>
+    <w:tbl>
+      <w:tblPr>
+        <w:tblStyle w:val="TableGrid"/>
+        <w:tblW w:type="auto" w:w="0"/>
+        <w:jc w:val="center"/>
+        <w:tblLook w:firstColumn="1" w:firstRow="1" w:lastColumn="0" w:lastRow="0" w:noHBand="0" w:noVBand="1" w:val="04A0"/>
+      </w:tblPr>
+      <w:tblGrid>
+        <w:gridCol w:w="2436"/>
+        <w:gridCol w:w="2436"/>
+        <w:gridCol w:w="2436"/>
+        <w:gridCol w:w="2436"/>
+      </w:tblGrid>
+      <w:tr>
+        <w:tc>
+          <w:tcPr>
+            <w:tcW w:type="dxa" w:w="2436"/>
+            <w:shd w:fill="D9EAF7"/>
+          </w:tcPr>
+          <w:p>
+            <w:r>
+              <w:rPr>
+                <w:rFonts w:ascii="Times New Roman" w:hAnsi="Times New Roman"/>
+                <w:b/>
                 <w:sz w:val="20"/>
               </w:rPr>
-              <w:t>41.000,00</w:t>
+              <w:t>Rechenblock</w:t>
+            </w:r>
+          </w:p>
+        </w:tc>
+        <w:tc>
+          <w:tcPr>
+            <w:tcW w:type="dxa" w:w="2436"/>
+            <w:shd w:fill="D9EAF7"/>
+          </w:tcPr>
+          <w:p>
+            <w:r>
+              <w:rPr>
+                <w:rFonts w:ascii="Times New Roman" w:hAnsi="Times New Roman"/>
+                <w:b/>
+                <w:sz w:val="20"/>
+              </w:rPr>
+              <w:t>Einnahmen</w:t>
+            </w:r>
+          </w:p>
+        </w:tc>
+        <w:tc>
+          <w:tcPr>
+            <w:tcW w:type="dxa" w:w="2436"/>
+            <w:shd w:fill="D9EAF7"/>
+          </w:tcPr>
+          <w:p>
+            <w:r>
+              <w:rPr>
+                <w:rFonts w:ascii="Times New Roman" w:hAnsi="Times New Roman"/>
+                <w:b/>
+                <w:sz w:val="20"/>
+              </w:rPr>
+              <w:t>Ausgaben</w:t>
+            </w:r>
+          </w:p>
+        </w:tc>
+        <w:tc>
+          <w:tcPr>
+            <w:tcW w:type="dxa" w:w="2436"/>
+            <w:shd w:fill="D9EAF7"/>
+          </w:tcPr>
+          <w:p>
+            <w:r>
+              <w:rPr>
+                <w:rFonts w:ascii="Times New Roman" w:hAnsi="Times New Roman"/>
+                <w:b/>
+                <w:sz w:val="20"/>
+              </w:rPr>
+              <w:t>Saldo</w:t>
             </w:r>
           </w:p>
         </w:tc>
@@ -680,29 +745,61 @@
       <w:tr>
         <w:tc>
           <w:tcPr>
-            <w:tcW w:type="dxa" w:w="4394"/>
+            <w:tcW w:type="dxa" w:w="2436"/>
+            <w:vAlign w:val="top"/>
           </w:tcPr>
           <w:p>
             <w:r>
               <w:rPr>
-                <w:rFonts w:ascii="Calibri" w:hAnsi="Calibri"/>
-                <w:sz w:val="20"/>
+                <w:rFonts w:ascii="Times New Roman" w:hAnsi="Times New Roman"/>
+                <w:sz w:val="18"/>
               </w:rPr>
-              <w:t>Kautionsrückzahlung Halle</w:t>
+              <w:t>Freie Massebewegungen</w:t>
             </w:r>
           </w:p>
         </w:tc>
         <w:tc>
           <w:tcPr>
-            <w:tcW w:type="dxa" w:w="4394"/>
+            <w:tcW w:type="dxa" w:w="2436"/>
+            <w:vAlign w:val="top"/>
           </w:tcPr>
           <w:p>
             <w:r>
               <w:rPr>
-                <w:rFonts w:ascii="Calibri" w:hAnsi="Calibri"/>
-                <w:sz w:val="20"/>
+                <w:rFonts w:ascii="Times New Roman" w:hAnsi="Times New Roman"/>
+                <w:sz w:val="18"/>
               </w:rPr>
-              <w:t>12.000,00</w:t>
+              <w:t>777.830,00 EUR</w:t>
+            </w:r>
+          </w:p>
+        </w:tc>
+        <w:tc>
+          <w:tcPr>
+            <w:tcW w:type="dxa" w:w="2436"/>
+            <w:vAlign w:val="top"/>
+          </w:tcPr>
+          <w:p>
+            <w:r>
+              <w:rPr>
+                <w:rFonts w:ascii="Times New Roman" w:hAnsi="Times New Roman"/>
+                <w:sz w:val="18"/>
+              </w:rPr>
+              <w:t>488.040,00 EUR</w:t>
+            </w:r>
+          </w:p>
+        </w:tc>
+        <w:tc>
+          <w:tcPr>
+            <w:tcW w:type="dxa" w:w="2436"/>
+            <w:vAlign w:val="top"/>
+          </w:tcPr>
+          <w:p>
+            <w:r>
+              <w:rPr>
+                <w:rFonts w:ascii="Times New Roman" w:hAnsi="Times New Roman"/>
+                <w:sz w:val="18"/>
+              </w:rPr>
+              <w:t>289.790,00 EUR</w:t>
             </w:r>
           </w:p>
         </w:tc>
@@ -710,29 +807,61 @@
       <w:tr>
         <w:tc>
           <w:tcPr>
-            <w:tcW w:type="dxa" w:w="4394"/>
+            <w:tcW w:type="dxa" w:w="2436"/>
+            <w:vAlign w:val="top"/>
           </w:tcPr>
           <w:p>
             <w:r>
               <w:rPr>
-                <w:rFonts w:ascii="Calibri" w:hAnsi="Calibri"/>
-                <w:sz w:val="20"/>
+                <w:rFonts w:ascii="Times New Roman" w:hAnsi="Times New Roman"/>
+                <w:sz w:val="18"/>
               </w:rPr>
-              <w:t>Kundenforderungen (globalzediert)</w:t>
+              <w:t>Sicherheitenkonto Havelbank</w:t>
             </w:r>
           </w:p>
         </w:tc>
         <w:tc>
           <w:tcPr>
-            <w:tcW w:type="dxa" w:w="4394"/>
+            <w:tcW w:type="dxa" w:w="2436"/>
+            <w:vAlign w:val="top"/>
           </w:tcPr>
           <w:p>
             <w:r>
               <w:rPr>
-                <w:rFonts w:ascii="Calibri" w:hAnsi="Calibri"/>
-                <w:sz w:val="20"/>
+                <w:rFonts w:ascii="Times New Roman" w:hAnsi="Times New Roman"/>
+                <w:sz w:val="18"/>
               </w:rPr>
-              <w:t>172.000,00</w:t>
+              <w:t>343.500,00 EUR</w:t>
+            </w:r>
+          </w:p>
+        </w:tc>
+        <w:tc>
+          <w:tcPr>
+            <w:tcW w:type="dxa" w:w="2436"/>
+            <w:vAlign w:val="top"/>
+          </w:tcPr>
+          <w:p>
+            <w:r>
+              <w:rPr>
+                <w:rFonts w:ascii="Times New Roman" w:hAnsi="Times New Roman"/>
+                <w:sz w:val="18"/>
+              </w:rPr>
+              <w:t>343.500,00 EUR</w:t>
+            </w:r>
+          </w:p>
+        </w:tc>
+        <w:tc>
+          <w:tcPr>
+            <w:tcW w:type="dxa" w:w="2436"/>
+            <w:vAlign w:val="top"/>
+          </w:tcPr>
+          <w:p>
+            <w:r>
+              <w:rPr>
+                <w:rFonts w:ascii="Times New Roman" w:hAnsi="Times New Roman"/>
+                <w:sz w:val="18"/>
+              </w:rPr>
+              <w:t>0,00 EUR</w:t>
             </w:r>
           </w:p>
         </w:tc>
@@ -740,682 +869,115 @@
       <w:tr>
         <w:tc>
           <w:tcPr>
-            <w:tcW w:type="dxa" w:w="4394"/>
+            <w:tcW w:type="dxa" w:w="2436"/>
+            <w:vAlign w:val="top"/>
           </w:tcPr>
           <w:p>
             <w:r>
               <w:rPr>
-                <w:rFonts w:ascii="Calibri" w:hAnsi="Calibri"/>
-                <w:sz w:val="20"/>
+                <w:rFonts w:ascii="Times New Roman" w:hAnsi="Times New Roman"/>
+                <w:sz w:val="18"/>
               </w:rPr>
-              <w:t>Kundenforderungen (frei)</w:t>
+              <w:t>Gesamter Geldfluss</w:t>
             </w:r>
           </w:p>
         </w:tc>
         <w:tc>
           <w:tcPr>
-            <w:tcW w:type="dxa" w:w="4394"/>
+            <w:tcW w:type="dxa" w:w="2436"/>
+            <w:vAlign w:val="top"/>
           </w:tcPr>
           <w:p>
             <w:r>
               <w:rPr>
-                <w:rFonts w:ascii="Calibri" w:hAnsi="Calibri"/>
-                <w:sz w:val="20"/>
+                <w:rFonts w:ascii="Times New Roman" w:hAnsi="Times New Roman"/>
+                <w:sz w:val="18"/>
               </w:rPr>
-              <w:t>18.400,00</w:t>
-            </w:r>
-          </w:p>
-        </w:tc>
-      </w:tr>
-      <w:tr>
-        <w:tc>
-          <w:tcPr>
-            <w:tcW w:type="dxa" w:w="4394"/>
-          </w:tcPr>
-          <w:p>
-            <w:r>
-              <w:rPr>
-                <w:rFonts w:ascii="Calibri" w:hAnsi="Calibri"/>
-                <w:sz w:val="20"/>
-              </w:rPr>
-              <w:t>EV-Vergleich Prignitz Forst KG</w:t>
+              <w:t>1.121.330,00 EUR</w:t>
             </w:r>
           </w:p>
         </w:tc>
         <w:tc>
           <w:tcPr>
-            <w:tcW w:type="dxa" w:w="4394"/>
+            <w:tcW w:type="dxa" w:w="2436"/>
+            <w:vAlign w:val="top"/>
           </w:tcPr>
           <w:p>
             <w:r>
               <w:rPr>
-                <w:rFonts w:ascii="Calibri" w:hAnsi="Calibri"/>
-                <w:sz w:val="20"/>
+                <w:rFonts w:ascii="Times New Roman" w:hAnsi="Times New Roman"/>
+                <w:sz w:val="18"/>
               </w:rPr>
-              <w:t>38.000,00</w:t>
-            </w:r>
-          </w:p>
-        </w:tc>
-      </w:tr>
-      <w:tr>
-        <w:tc>
-          <w:tcPr>
-            <w:tcW w:type="dxa" w:w="4394"/>
-          </w:tcPr>
-          <w:p>
-            <w:r>
-              <w:rPr>
-                <w:rFonts w:ascii="Calibri" w:hAnsi="Calibri"/>
-                <w:sz w:val="20"/>
-              </w:rPr>
-              <w:t>D&amp;O-Vergleich</w:t>
+              <w:t>831.540,00 EUR</w:t>
             </w:r>
           </w:p>
         </w:tc>
         <w:tc>
           <w:tcPr>
-            <w:tcW w:type="dxa" w:w="4394"/>
+            <w:tcW w:type="dxa" w:w="2436"/>
+            <w:vAlign w:val="top"/>
           </w:tcPr>
           <w:p>
             <w:r>
               <w:rPr>
-                <w:rFonts w:ascii="Calibri" w:hAnsi="Calibri"/>
-                <w:sz w:val="20"/>
+                <w:rFonts w:ascii="Times New Roman" w:hAnsi="Times New Roman"/>
+                <w:sz w:val="18"/>
               </w:rPr>
-              <w:t>115.000,00</w:t>
-            </w:r>
-          </w:p>
-        </w:tc>
-      </w:tr>
-      <w:tr>
-        <w:tc>
-          <w:tcPr>
-            <w:tcW w:type="dxa" w:w="4394"/>
-          </w:tcPr>
-          <w:p>
-            <w:r>
-              <w:rPr>
-                <w:rFonts w:ascii="Calibri" w:hAnsi="Calibri"/>
-                <w:sz w:val="20"/>
-              </w:rPr>
-              <w:t>Anfechtungserlöse</w:t>
-            </w:r>
-          </w:p>
-        </w:tc>
-        <w:tc>
-          <w:tcPr>
-            <w:tcW w:type="dxa" w:w="4394"/>
-          </w:tcPr>
-          <w:p>
-            <w:r>
-              <w:rPr>
-                <w:rFonts w:ascii="Calibri" w:hAnsi="Calibri"/>
-                <w:sz w:val="20"/>
-              </w:rPr>
-              <w:t>41.000,00</w:t>
-            </w:r>
-          </w:p>
-        </w:tc>
-      </w:tr>
-      <w:tr>
-        <w:tc>
-          <w:tcPr>
-            <w:tcW w:type="dxa" w:w="4394"/>
-          </w:tcPr>
-          <w:p>
-            <w:r>
-              <w:rPr>
-                <w:rFonts w:ascii="Calibri" w:hAnsi="Calibri"/>
-                <w:sz w:val="20"/>
-              </w:rPr>
-              <w:t>Steuererstattung 2026</w:t>
-            </w:r>
-          </w:p>
-        </w:tc>
-        <w:tc>
-          <w:tcPr>
-            <w:tcW w:type="dxa" w:w="4394"/>
-          </w:tcPr>
-          <w:p>
-            <w:r>
-              <w:rPr>
-                <w:rFonts w:ascii="Calibri" w:hAnsi="Calibri"/>
-                <w:sz w:val="20"/>
-              </w:rPr>
-              <w:t>14.200,00</w:t>
-            </w:r>
-          </w:p>
-        </w:tc>
-      </w:tr>
-      <w:tr>
-        <w:tc>
-          <w:tcPr>
-            <w:tcW w:type="dxa" w:w="4394"/>
-            <w:shd w:val="clear" w:color="auto" w:fill="E2EFDA"/>
-          </w:tcPr>
-          <w:p>
-            <w:r>
-              <w:rPr>
-                <w:rFonts w:ascii="Calibri" w:hAnsi="Calibri"/>
-                <w:b/>
-                <w:sz w:val="20"/>
-              </w:rPr>
-              <w:t>SUMME EINNAHMEN</w:t>
-            </w:r>
-          </w:p>
-        </w:tc>
-        <w:tc>
-          <w:tcPr>
-            <w:tcW w:type="dxa" w:w="4394"/>
-            <w:shd w:val="clear" w:color="auto" w:fill="E2EFDA"/>
-          </w:tcPr>
-          <w:p>
-            <w:r>
-              <w:rPr>
-                <w:rFonts w:ascii="Calibri" w:hAnsi="Calibri"/>
-                <w:b/>
-                <w:sz w:val="20"/>
-              </w:rPr>
-              <w:t>777.830,00</w:t>
+              <w:t>289.790,00 EUR</w:t>
             </w:r>
           </w:p>
         </w:tc>
       </w:tr>
     </w:tbl>
+    <w:p/>
     <w:p>
       <w:pPr>
-        <w:spacing w:line="259" w:lineRule="auto" w:after="60"/>
+        <w:spacing w:after="120"/>
       </w:pPr>
+      <w:r>
+        <w:t>Der rechnerische Endbestand von 289.790,00 EUR stimmt mit dem Massekonto überein. Das Sicherheitenkonto weist nach der Auskehrung 0,00 EUR aus. Interne Umbuchungen wurden neutralisiert. Die frühere Arbeitsfassung, die den Sicherheitenfluss nur im erläuternden Text führte, ist durch diese vollständige Geldflussdarstellung ersetzt.</w:t>
+      </w:r>
     </w:p>
     <w:p>
       <w:pPr>
-        <w:spacing w:line="259" w:lineRule="auto" w:after="60"/>
-        <w:jc w:val="both"/>
+        <w:pStyle w:val="Heading1"/>
       </w:pPr>
       <w:r>
-        <w:rPr>
-          <w:rFonts w:ascii="Calibri" w:hAnsi="Calibri"/>
-          <w:b/>
-          <w:sz w:val="22"/>
-        </w:rPr>
-        <w:t>Ausgaben:</w:t>
+        <w:t>5. Forderungen und Verteilungsbasis</w:t>
+      </w:r>
+    </w:p>
+    <w:p>
+      <w:pPr>
+        <w:spacing w:after="120"/>
+      </w:pPr>
+      <w:r>
+        <w:t>Die festgestellten Forderungen nach § 38 InsO betragen 862.900,00 EUR. Der vollständig bestrittene Anspruch M. Kordes ist mangels fristgerechten Nachweises nicht in die Verteilungsbasis aufgenommen. Die nachrangige Forderung Tim Brauer über 120.000,00 EUR erhält keine Zahlung.</w:t>
       </w:r>
     </w:p>
     <w:tbl>
       <w:tblPr>
         <w:tblStyle w:val="TableGrid"/>
         <w:tblW w:type="auto" w:w="0"/>
+        <w:jc w:val="center"/>
         <w:tblLook w:firstColumn="1" w:firstRow="1" w:lastColumn="0" w:lastRow="0" w:noHBand="0" w:noVBand="1" w:val="04A0"/>
       </w:tblPr>
       <w:tblGrid>
-        <w:gridCol w:w="4394"/>
-        <w:gridCol w:w="4394"/>
+        <w:gridCol w:w="3248"/>
+        <w:gridCol w:w="3248"/>
+        <w:gridCol w:w="3248"/>
       </w:tblGrid>
       <w:tr>
         <w:tc>
           <w:tcPr>
-            <w:tcW w:type="dxa" w:w="4394"/>
-            <w:shd w:val="clear" w:color="auto" w:fill="2E75B6"/>
+            <w:tcW w:type="dxa" w:w="3248"/>
+            <w:shd w:fill="D9EAF7"/>
           </w:tcPr>
           <w:p>
             <w:r>
               <w:rPr>
-                <w:rFonts w:ascii="Calibri" w:hAnsi="Calibri"/>
-                <w:b/>
-                <w:color w:val="FFFFFF"/>
-                <w:sz w:val="20"/>
-              </w:rPr>
-              <w:t>Position</w:t>
-            </w:r>
-          </w:p>
-        </w:tc>
-        <w:tc>
-          <w:tcPr>
-            <w:tcW w:type="dxa" w:w="4394"/>
-            <w:shd w:val="clear" w:color="auto" w:fill="2E75B6"/>
-          </w:tcPr>
-          <w:p>
-            <w:r>
-              <w:rPr>
-                <w:rFonts w:ascii="Calibri" w:hAnsi="Calibri"/>
-                <w:b/>
-                <w:color w:val="FFFFFF"/>
-                <w:sz w:val="20"/>
-              </w:rPr>
-              <w:t>Betrag (EUR)</w:t>
-            </w:r>
-          </w:p>
-        </w:tc>
-      </w:tr>
-      <w:tr>
-        <w:tc>
-          <w:tcPr>
-            <w:tcW w:type="dxa" w:w="4394"/>
-          </w:tcPr>
-          <w:p>
-            <w:r>
-              <w:rPr>
-                <w:rFonts w:ascii="Calibri" w:hAnsi="Calibri"/>
-                <w:sz w:val="20"/>
-              </w:rPr>
-              <w:t>Betriebsfortführungskosten</w:t>
-            </w:r>
-          </w:p>
-        </w:tc>
-        <w:tc>
-          <w:tcPr>
-            <w:tcW w:type="dxa" w:w="4394"/>
-          </w:tcPr>
-          <w:p>
-            <w:r>
-              <w:rPr>
-                <w:rFonts w:ascii="Calibri" w:hAnsi="Calibri"/>
-                <w:sz w:val="20"/>
-              </w:rPr>
-              <w:t>43.200,00</w:t>
-            </w:r>
-          </w:p>
-        </w:tc>
-      </w:tr>
-      <w:tr>
-        <w:tc>
-          <w:tcPr>
-            <w:tcW w:type="dxa" w:w="4394"/>
-          </w:tcPr>
-          <w:p>
-            <w:r>
-              <w:rPr>
-                <w:rFonts w:ascii="Calibri" w:hAnsi="Calibri"/>
-                <w:sz w:val="20"/>
-              </w:rPr>
-              <w:t>Löhne Fortführungsphase</w:t>
-            </w:r>
-          </w:p>
-        </w:tc>
-        <w:tc>
-          <w:tcPr>
-            <w:tcW w:type="dxa" w:w="4394"/>
-          </w:tcPr>
-          <w:p>
-            <w:r>
-              <w:rPr>
-                <w:rFonts w:ascii="Calibri" w:hAnsi="Calibri"/>
-                <w:sz w:val="20"/>
-              </w:rPr>
-              <w:t>24.800,00</w:t>
-            </w:r>
-          </w:p>
-        </w:tc>
-      </w:tr>
-      <w:tr>
-        <w:tc>
-          <w:tcPr>
-            <w:tcW w:type="dxa" w:w="4394"/>
-          </w:tcPr>
-          <w:p>
-            <w:r>
-              <w:rPr>
-                <w:rFonts w:ascii="Calibri" w:hAnsi="Calibri"/>
-                <w:sz w:val="20"/>
-              </w:rPr>
-              <w:t>Insolvenzgeld-Vorfinanzierung (Rückzahlung)</w:t>
-            </w:r>
-          </w:p>
-        </w:tc>
-        <w:tc>
-          <w:tcPr>
-            <w:tcW w:type="dxa" w:w="4394"/>
-          </w:tcPr>
-          <w:p>
-            <w:r>
-              <w:rPr>
-                <w:rFonts w:ascii="Calibri" w:hAnsi="Calibri"/>
-                <w:sz w:val="20"/>
-              </w:rPr>
-              <w:t>236.000,00</w:t>
-            </w:r>
-          </w:p>
-        </w:tc>
-      </w:tr>
-      <w:tr>
-        <w:tc>
-          <w:tcPr>
-            <w:tcW w:type="dxa" w:w="4394"/>
-          </w:tcPr>
-          <w:p>
-            <w:r>
-              <w:rPr>
-                <w:rFonts w:ascii="Calibri" w:hAnsi="Calibri"/>
-                <w:sz w:val="20"/>
-              </w:rPr>
-              <w:t>Masseverbindlichkeiten Lieferanten</w:t>
-            </w:r>
-          </w:p>
-        </w:tc>
-        <w:tc>
-          <w:tcPr>
-            <w:tcW w:type="dxa" w:w="4394"/>
-          </w:tcPr>
-          <w:p>
-            <w:r>
-              <w:rPr>
-                <w:rFonts w:ascii="Calibri" w:hAnsi="Calibri"/>
-                <w:sz w:val="20"/>
-              </w:rPr>
-              <w:t>42.000,00</w:t>
-            </w:r>
-          </w:p>
-        </w:tc>
-      </w:tr>
-      <w:tr>
-        <w:tc>
-          <w:tcPr>
-            <w:tcW w:type="dxa" w:w="4394"/>
-          </w:tcPr>
-          <w:p>
-            <w:r>
-              <w:rPr>
-                <w:rFonts w:ascii="Calibri" w:hAnsi="Calibri"/>
-                <w:sz w:val="20"/>
-              </w:rPr>
-              <w:t>Masseverbindlichkeiten Miete</w:t>
-            </w:r>
-          </w:p>
-        </w:tc>
-        <w:tc>
-          <w:tcPr>
-            <w:tcW w:type="dxa" w:w="4394"/>
-          </w:tcPr>
-          <w:p>
-            <w:r>
-              <w:rPr>
-                <w:rFonts w:ascii="Calibri" w:hAnsi="Calibri"/>
-                <w:sz w:val="20"/>
-              </w:rPr>
-              <w:t>18.000,00</w:t>
-            </w:r>
-          </w:p>
-        </w:tc>
-      </w:tr>
-      <w:tr>
-        <w:tc>
-          <w:tcPr>
-            <w:tcW w:type="dxa" w:w="4394"/>
-          </w:tcPr>
-          <w:p>
-            <w:r>
-              <w:rPr>
-                <w:rFonts w:ascii="Calibri" w:hAnsi="Calibri"/>
-                <w:sz w:val="20"/>
-              </w:rPr>
-              <w:t>Masseverbindlichkeiten Steuer (Fortführung)</w:t>
-            </w:r>
-          </w:p>
-        </w:tc>
-        <w:tc>
-          <w:tcPr>
-            <w:tcW w:type="dxa" w:w="4394"/>
-          </w:tcPr>
-          <w:p>
-            <w:r>
-              <w:rPr>
-                <w:rFonts w:ascii="Calibri" w:hAnsi="Calibri"/>
-                <w:sz w:val="20"/>
-              </w:rPr>
-              <w:t>21.000,00</w:t>
-            </w:r>
-          </w:p>
-        </w:tc>
-      </w:tr>
-      <w:tr>
-        <w:tc>
-          <w:tcPr>
-            <w:tcW w:type="dxa" w:w="4394"/>
-          </w:tcPr>
-          <w:p>
-            <w:r>
-              <w:rPr>
-                <w:rFonts w:ascii="Calibri" w:hAnsi="Calibri"/>
-                <w:sz w:val="20"/>
-              </w:rPr>
-              <w:t>Sachverständigenhonorar</w:t>
-            </w:r>
-          </w:p>
-        </w:tc>
-        <w:tc>
-          <w:tcPr>
-            <w:tcW w:type="dxa" w:w="4394"/>
-          </w:tcPr>
-          <w:p>
-            <w:r>
-              <w:rPr>
-                <w:rFonts w:ascii="Calibri" w:hAnsi="Calibri"/>
-                <w:sz w:val="20"/>
-              </w:rPr>
-              <w:t>6.600,00</w:t>
-            </w:r>
-          </w:p>
-        </w:tc>
-      </w:tr>
-      <w:tr>
-        <w:tc>
-          <w:tcPr>
-            <w:tcW w:type="dxa" w:w="4394"/>
-          </w:tcPr>
-          <w:p>
-            <w:r>
-              <w:rPr>
-                <w:rFonts w:ascii="Calibri" w:hAnsi="Calibri"/>
-                <w:sz w:val="20"/>
-              </w:rPr>
-              <w:t>Verwertungsprovisionen (4 %)</w:t>
-            </w:r>
-          </w:p>
-        </w:tc>
-        <w:tc>
-          <w:tcPr>
-            <w:tcW w:type="dxa" w:w="4394"/>
-          </w:tcPr>
-          <w:p>
-            <w:r>
-              <w:rPr>
-                <w:rFonts w:ascii="Calibri" w:hAnsi="Calibri"/>
-                <w:sz w:val="20"/>
-              </w:rPr>
-              <w:t>12.040,00</w:t>
-            </w:r>
-          </w:p>
-        </w:tc>
-      </w:tr>
-      <w:tr>
-        <w:tc>
-          <w:tcPr>
-            <w:tcW w:type="dxa" w:w="4394"/>
-          </w:tcPr>
-          <w:p>
-            <w:r>
-              <w:rPr>
-                <w:rFonts w:ascii="Calibri" w:hAnsi="Calibri"/>
-                <w:sz w:val="20"/>
-              </w:rPr>
-              <w:t>Gerichtskosten</w:t>
-            </w:r>
-          </w:p>
-        </w:tc>
-        <w:tc>
-          <w:tcPr>
-            <w:tcW w:type="dxa" w:w="4394"/>
-          </w:tcPr>
-          <w:p>
-            <w:r>
-              <w:rPr>
-                <w:rFonts w:ascii="Calibri" w:hAnsi="Calibri"/>
-                <w:sz w:val="20"/>
-              </w:rPr>
-              <w:t>8.200,00</w:t>
-            </w:r>
-          </w:p>
-        </w:tc>
-      </w:tr>
-      <w:tr>
-        <w:tc>
-          <w:tcPr>
-            <w:tcW w:type="dxa" w:w="4394"/>
-          </w:tcPr>
-          <w:p>
-            <w:r>
-              <w:rPr>
-                <w:rFonts w:ascii="Calibri" w:hAnsi="Calibri"/>
-                <w:sz w:val="20"/>
-              </w:rPr>
-              <w:t>Bekanntmachungen, Zustellungen</w:t>
-            </w:r>
-          </w:p>
-        </w:tc>
-        <w:tc>
-          <w:tcPr>
-            <w:tcW w:type="dxa" w:w="4394"/>
-          </w:tcPr>
-          <w:p>
-            <w:r>
-              <w:rPr>
-                <w:rFonts w:ascii="Calibri" w:hAnsi="Calibri"/>
-                <w:sz w:val="20"/>
-              </w:rPr>
-              <w:t>1.400,00</w:t>
-            </w:r>
-          </w:p>
-        </w:tc>
-      </w:tr>
-      <w:tr>
-        <w:tc>
-          <w:tcPr>
-            <w:tcW w:type="dxa" w:w="4394"/>
-          </w:tcPr>
-          <w:p>
-            <w:r>
-              <w:rPr>
-                <w:rFonts w:ascii="Calibri" w:hAnsi="Calibri"/>
-                <w:sz w:val="20"/>
-              </w:rPr>
-              <w:t>IV-Vergütung inkl. MwSt.</w:t>
-            </w:r>
-          </w:p>
-        </w:tc>
-        <w:tc>
-          <w:tcPr>
-            <w:tcW w:type="dxa" w:w="4394"/>
-          </w:tcPr>
-          <w:p>
-            <w:r>
-              <w:rPr>
-                <w:rFonts w:ascii="Calibri" w:hAnsi="Calibri"/>
-                <w:sz w:val="20"/>
-              </w:rPr>
-              <w:t>74.800,00</w:t>
-            </w:r>
-          </w:p>
-        </w:tc>
-      </w:tr>
-      <w:tr>
-        <w:tc>
-          <w:tcPr>
-            <w:tcW w:type="dxa" w:w="4394"/>
-            <w:shd w:val="clear" w:color="auto" w:fill="FCE4D6"/>
-          </w:tcPr>
-          <w:p>
-            <w:r>
-              <w:rPr>
-                <w:rFonts w:ascii="Calibri" w:hAnsi="Calibri"/>
+                <w:rFonts w:ascii="Times New Roman" w:hAnsi="Times New Roman"/>
                 <w:b/>
                 <w:sz w:val="20"/>
-              </w:rPr>
-              <w:t>SUMME AUSGABEN</w:t>
-            </w:r>
-          </w:p>
-        </w:tc>
-        <w:tc>
-          <w:tcPr>
-            <w:tcW w:type="dxa" w:w="4394"/>
-            <w:shd w:val="clear" w:color="auto" w:fill="FCE4D6"/>
-          </w:tcPr>
-          <w:p>
-            <w:r>
-              <w:rPr>
-                <w:rFonts w:ascii="Calibri" w:hAnsi="Calibri"/>
-                <w:b/>
-                <w:sz w:val="20"/>
-              </w:rPr>
-              <w:t>488.040,00</w:t>
-            </w:r>
-          </w:p>
-        </w:tc>
-      </w:tr>
-    </w:tbl>
-    <w:p>
-      <w:pPr>
-        <w:spacing w:line="259" w:lineRule="auto" w:after="60"/>
-      </w:pPr>
-    </w:p>
-    <w:p>
-      <w:pPr>
-        <w:spacing w:line="259" w:lineRule="auto" w:after="60"/>
-        <w:jc w:val="both"/>
-      </w:pPr>
-      <w:r>
-        <w:rPr>
-          <w:rFonts w:ascii="Calibri" w:hAnsi="Calibri"/>
-          <w:b/>
-          <w:sz w:val="24"/>
-        </w:rPr>
-        <w:t>Verteilungsmasse für § 38-Gläubiger: 289.790,00 EUR | Quote: ca. 18,4 %</w:t>
-      </w:r>
-    </w:p>
-    <w:p>
-      <w:pPr>
-        <w:spacing w:line="259" w:lineRule="auto" w:after="60"/>
-      </w:pPr>
-    </w:p>
-    <w:p>
-      <w:pPr>
-        <w:spacing w:line="259" w:lineRule="auto" w:after="60"/>
-        <w:jc w:val="left"/>
-      </w:pPr>
-      <w:r>
-        <w:rPr>
-          <w:rFonts w:ascii="Calibri" w:hAnsi="Calibri"/>
-          <w:b/>
-          <w:sz w:val="24"/>
-        </w:rPr>
-        <w:t>III. Forderungstabelle (Zusammenfassung)</w:t>
-      </w:r>
-    </w:p>
-    <w:tbl>
-      <w:tblPr>
-        <w:tblStyle w:val="TableGrid"/>
-        <w:tblW w:type="auto" w:w="0"/>
-        <w:tblLook w:firstColumn="1" w:firstRow="1" w:lastColumn="0" w:lastRow="0" w:noHBand="0" w:noVBand="1" w:val="04A0"/>
-      </w:tblPr>
-      <w:tblGrid>
-        <w:gridCol w:w="1758"/>
-        <w:gridCol w:w="1758"/>
-        <w:gridCol w:w="1758"/>
-        <w:gridCol w:w="1758"/>
-        <w:gridCol w:w="1758"/>
-      </w:tblGrid>
-      <w:tr>
-        <w:tc>
-          <w:tcPr>
-            <w:tcW w:type="dxa" w:w="1758"/>
-            <w:shd w:val="clear" w:color="auto" w:fill="2E75B6"/>
-          </w:tcPr>
-          <w:p>
-            <w:r>
-              <w:rPr>
-                <w:rFonts w:ascii="Calibri" w:hAnsi="Calibri"/>
-                <w:b/>
-                <w:color w:val="FFFFFF"/>
-                <w:sz w:val="18"/>
               </w:rPr>
               <w:t>Gläubiger</w:t>
             </w:r>
@@ -1423,67 +985,31 @@
         </w:tc>
         <w:tc>
           <w:tcPr>
-            <w:tcW w:type="dxa" w:w="1758"/>
-            <w:shd w:val="clear" w:color="auto" w:fill="2E75B6"/>
+            <w:tcW w:type="dxa" w:w="3248"/>
+            <w:shd w:fill="D9EAF7"/>
           </w:tcPr>
           <w:p>
             <w:r>
               <w:rPr>
-                <w:rFonts w:ascii="Calibri" w:hAnsi="Calibri"/>
+                <w:rFonts w:ascii="Times New Roman" w:hAnsi="Times New Roman"/>
                 <w:b/>
-                <w:color w:val="FFFFFF"/>
-                <w:sz w:val="18"/>
+                <w:sz w:val="20"/>
               </w:rPr>
-              <w:t>Angemeldet</w:t>
+              <w:t>Verteilungsforderung</w:t>
             </w:r>
           </w:p>
         </w:tc>
         <w:tc>
           <w:tcPr>
-            <w:tcW w:type="dxa" w:w="1758"/>
-            <w:shd w:val="clear" w:color="auto" w:fill="2E75B6"/>
+            <w:tcW w:type="dxa" w:w="3248"/>
+            <w:shd w:fill="D9EAF7"/>
           </w:tcPr>
           <w:p>
             <w:r>
               <w:rPr>
-                <w:rFonts w:ascii="Calibri" w:hAnsi="Calibri"/>
+                <w:rFonts w:ascii="Times New Roman" w:hAnsi="Times New Roman"/>
                 <w:b/>
-                <w:color w:val="FFFFFF"/>
-                <w:sz w:val="18"/>
-              </w:rPr>
-              <w:t>Festgestellt</w:t>
-            </w:r>
-          </w:p>
-        </w:tc>
-        <w:tc>
-          <w:tcPr>
-            <w:tcW w:type="dxa" w:w="1758"/>
-            <w:shd w:val="clear" w:color="auto" w:fill="2E75B6"/>
-          </w:tcPr>
-          <w:p>
-            <w:r>
-              <w:rPr>
-                <w:rFonts w:ascii="Calibri" w:hAnsi="Calibri"/>
-                <w:b/>
-                <w:color w:val="FFFFFF"/>
-                <w:sz w:val="18"/>
-              </w:rPr>
-              <w:t>Quote %</w:t>
-            </w:r>
-          </w:p>
-        </w:tc>
-        <w:tc>
-          <w:tcPr>
-            <w:tcW w:type="dxa" w:w="1758"/>
-            <w:shd w:val="clear" w:color="auto" w:fill="2E75B6"/>
-          </w:tcPr>
-          <w:p>
-            <w:r>
-              <w:rPr>
-                <w:rFonts w:ascii="Calibri" w:hAnsi="Calibri"/>
-                <w:b/>
-                <w:color w:val="FFFFFF"/>
-                <w:sz w:val="18"/>
+                <w:sz w:val="20"/>
               </w:rPr>
               <w:t>Auszahlung</w:t>
             </w:r>
@@ -1493,12 +1019,13 @@
       <w:tr>
         <w:tc>
           <w:tcPr>
-            <w:tcW w:type="dxa" w:w="1758"/>
+            <w:tcW w:type="dxa" w:w="3248"/>
+            <w:vAlign w:val="top"/>
           </w:tcPr>
           <w:p>
             <w:r>
               <w:rPr>
-                <w:rFonts w:ascii="Calibri" w:hAnsi="Calibri"/>
+                <w:rFonts w:ascii="Times New Roman" w:hAnsi="Times New Roman"/>
                 <w:sz w:val="18"/>
               </w:rPr>
               <w:t>Furnier Nord GmbH</w:t>
@@ -1507,57 +1034,31 @@
         </w:tc>
         <w:tc>
           <w:tcPr>
-            <w:tcW w:type="dxa" w:w="1758"/>
+            <w:tcW w:type="dxa" w:w="3248"/>
+            <w:vAlign w:val="top"/>
           </w:tcPr>
           <w:p>
             <w:r>
               <w:rPr>
-                <w:rFonts w:ascii="Calibri" w:hAnsi="Calibri"/>
+                <w:rFonts w:ascii="Times New Roman" w:hAnsi="Times New Roman"/>
                 <w:sz w:val="18"/>
               </w:rPr>
-              <w:t>186.420</w:t>
+              <w:t>186.420,00 EUR</w:t>
             </w:r>
           </w:p>
         </w:tc>
         <w:tc>
           <w:tcPr>
-            <w:tcW w:type="dxa" w:w="1758"/>
+            <w:tcW w:type="dxa" w:w="3248"/>
+            <w:vAlign w:val="top"/>
           </w:tcPr>
           <w:p>
             <w:r>
               <w:rPr>
-                <w:rFonts w:ascii="Calibri" w:hAnsi="Calibri"/>
+                <w:rFonts w:ascii="Times New Roman" w:hAnsi="Times New Roman"/>
                 <w:sz w:val="18"/>
               </w:rPr>
-              <w:t>186.420</w:t>
-            </w:r>
-          </w:p>
-        </w:tc>
-        <w:tc>
-          <w:tcPr>
-            <w:tcW w:type="dxa" w:w="1758"/>
-          </w:tcPr>
-          <w:p>
-            <w:r>
-              <w:rPr>
-                <w:rFonts w:ascii="Calibri" w:hAnsi="Calibri"/>
-                <w:sz w:val="18"/>
-              </w:rPr>
-              <w:t>18,4</w:t>
-            </w:r>
-          </w:p>
-        </w:tc>
-        <w:tc>
-          <w:tcPr>
-            <w:tcW w:type="dxa" w:w="1758"/>
-          </w:tcPr>
-          <w:p>
-            <w:r>
-              <w:rPr>
-                <w:rFonts w:ascii="Calibri" w:hAnsi="Calibri"/>
-                <w:sz w:val="18"/>
-              </w:rPr>
-              <w:t>34.305,00</w:t>
+              <w:t>62.605,92 EUR</w:t>
             </w:r>
           </w:p>
         </w:tc>
@@ -1565,71 +1066,46 @@
       <w:tr>
         <w:tc>
           <w:tcPr>
-            <w:tcW w:type="dxa" w:w="1758"/>
+            <w:tcW w:type="dxa" w:w="3248"/>
+            <w:vAlign w:val="top"/>
           </w:tcPr>
           <w:p>
             <w:r>
               <w:rPr>
-                <w:rFonts w:ascii="Calibri" w:hAnsi="Calibri"/>
+                <w:rFonts w:ascii="Times New Roman" w:hAnsi="Times New Roman"/>
                 <w:sz w:val="18"/>
               </w:rPr>
-              <w:t>Havelbank eG (Ausfall)</w:t>
+              <w:t>Havelbank eG – Ausfall</w:t>
             </w:r>
           </w:p>
         </w:tc>
         <w:tc>
           <w:tcPr>
-            <w:tcW w:type="dxa" w:w="1758"/>
+            <w:tcW w:type="dxa" w:w="3248"/>
+            <w:vAlign w:val="top"/>
           </w:tcPr>
           <w:p>
             <w:r>
               <w:rPr>
-                <w:rFonts w:ascii="Calibri" w:hAnsi="Calibri"/>
+                <w:rFonts w:ascii="Times New Roman" w:hAnsi="Times New Roman"/>
                 <w:sz w:val="18"/>
               </w:rPr>
-              <w:t>136.500</w:t>
+              <w:t>136.500,00 EUR</w:t>
             </w:r>
           </w:p>
         </w:tc>
         <w:tc>
           <w:tcPr>
-            <w:tcW w:type="dxa" w:w="1758"/>
+            <w:tcW w:type="dxa" w:w="3248"/>
+            <w:vAlign w:val="top"/>
           </w:tcPr>
           <w:p>
             <w:r>
               <w:rPr>
-                <w:rFonts w:ascii="Calibri" w:hAnsi="Calibri"/>
+                <w:rFonts w:ascii="Times New Roman" w:hAnsi="Times New Roman"/>
                 <w:sz w:val="18"/>
               </w:rPr>
-              <w:t>136.500</w:t>
-            </w:r>
-          </w:p>
-        </w:tc>
-        <w:tc>
-          <w:tcPr>
-            <w:tcW w:type="dxa" w:w="1758"/>
-          </w:tcPr>
-          <w:p>
-            <w:r>
-              <w:rPr>
-                <w:rFonts w:ascii="Calibri" w:hAnsi="Calibri"/>
-                <w:sz w:val="18"/>
-              </w:rPr>
-              <w:t>18,4</w:t>
-            </w:r>
-          </w:p>
-        </w:tc>
-        <w:tc>
-          <w:tcPr>
-            <w:tcW w:type="dxa" w:w="1758"/>
-          </w:tcPr>
-          <w:p>
-            <w:r>
-              <w:rPr>
-                <w:rFonts w:ascii="Calibri" w:hAnsi="Calibri"/>
-                <w:sz w:val="18"/>
-              </w:rPr>
-              <w:t>25.116,00</w:t>
+              <w:t>45.841,16 EUR</w:t>
             </w:r>
           </w:p>
         </w:tc>
@@ -1637,12 +1113,13 @@
       <w:tr>
         <w:tc>
           <w:tcPr>
-            <w:tcW w:type="dxa" w:w="1758"/>
+            <w:tcW w:type="dxa" w:w="3248"/>
+            <w:vAlign w:val="top"/>
           </w:tcPr>
           <w:p>
             <w:r>
               <w:rPr>
-                <w:rFonts w:ascii="Calibri" w:hAnsi="Calibri"/>
+                <w:rFonts w:ascii="Times New Roman" w:hAnsi="Times New Roman"/>
                 <w:sz w:val="18"/>
               </w:rPr>
               <w:t>Finanzamt Stendal</w:t>
@@ -1651,57 +1128,31 @@
         </w:tc>
         <w:tc>
           <w:tcPr>
-            <w:tcW w:type="dxa" w:w="1758"/>
+            <w:tcW w:type="dxa" w:w="3248"/>
+            <w:vAlign w:val="top"/>
           </w:tcPr>
           <w:p>
             <w:r>
               <w:rPr>
-                <w:rFonts w:ascii="Calibri" w:hAnsi="Calibri"/>
+                <w:rFonts w:ascii="Times New Roman" w:hAnsi="Times New Roman"/>
                 <w:sz w:val="18"/>
               </w:rPr>
-              <w:t>92.340</w:t>
+              <w:t>92.340,00 EUR</w:t>
             </w:r>
           </w:p>
         </w:tc>
         <w:tc>
           <w:tcPr>
-            <w:tcW w:type="dxa" w:w="1758"/>
+            <w:tcW w:type="dxa" w:w="3248"/>
+            <w:vAlign w:val="top"/>
           </w:tcPr>
           <w:p>
             <w:r>
               <w:rPr>
-                <w:rFonts w:ascii="Calibri" w:hAnsi="Calibri"/>
+                <w:rFonts w:ascii="Times New Roman" w:hAnsi="Times New Roman"/>
                 <w:sz w:val="18"/>
               </w:rPr>
-              <w:t>92.340</w:t>
-            </w:r>
-          </w:p>
-        </w:tc>
-        <w:tc>
-          <w:tcPr>
-            <w:tcW w:type="dxa" w:w="1758"/>
-          </w:tcPr>
-          <w:p>
-            <w:r>
-              <w:rPr>
-                <w:rFonts w:ascii="Calibri" w:hAnsi="Calibri"/>
-                <w:sz w:val="18"/>
-              </w:rPr>
-              <w:t>18,4</w:t>
-            </w:r>
-          </w:p>
-        </w:tc>
-        <w:tc>
-          <w:tcPr>
-            <w:tcW w:type="dxa" w:w="1758"/>
-          </w:tcPr>
-          <w:p>
-            <w:r>
-              <w:rPr>
-                <w:rFonts w:ascii="Calibri" w:hAnsi="Calibri"/>
-                <w:sz w:val="18"/>
-              </w:rPr>
-              <w:t>16.990,56</w:t>
+              <w:t>31.010,79 EUR</w:t>
             </w:r>
           </w:p>
         </w:tc>
@@ -1709,12 +1160,13 @@
       <w:tr>
         <w:tc>
           <w:tcPr>
-            <w:tcW w:type="dxa" w:w="1758"/>
+            <w:tcW w:type="dxa" w:w="3248"/>
+            <w:vAlign w:val="top"/>
           </w:tcPr>
           <w:p>
             <w:r>
               <w:rPr>
-                <w:rFonts w:ascii="Calibri" w:hAnsi="Calibri"/>
+                <w:rFonts w:ascii="Times New Roman" w:hAnsi="Times New Roman"/>
                 <w:sz w:val="18"/>
               </w:rPr>
               <w:t>AOK Sachsen-Anhalt</w:t>
@@ -1723,57 +1175,31 @@
         </w:tc>
         <w:tc>
           <w:tcPr>
-            <w:tcW w:type="dxa" w:w="1758"/>
+            <w:tcW w:type="dxa" w:w="3248"/>
+            <w:vAlign w:val="top"/>
           </w:tcPr>
           <w:p>
             <w:r>
               <w:rPr>
-                <w:rFonts w:ascii="Calibri" w:hAnsi="Calibri"/>
+                <w:rFonts w:ascii="Times New Roman" w:hAnsi="Times New Roman"/>
                 <w:sz w:val="18"/>
               </w:rPr>
-              <w:t>61.200</w:t>
+              <w:t>61.200,00 EUR</w:t>
             </w:r>
           </w:p>
         </w:tc>
         <w:tc>
           <w:tcPr>
-            <w:tcW w:type="dxa" w:w="1758"/>
+            <w:tcW w:type="dxa" w:w="3248"/>
+            <w:vAlign w:val="top"/>
           </w:tcPr>
           <w:p>
             <w:r>
               <w:rPr>
-                <w:rFonts w:ascii="Calibri" w:hAnsi="Calibri"/>
+                <w:rFonts w:ascii="Times New Roman" w:hAnsi="Times New Roman"/>
                 <w:sz w:val="18"/>
               </w:rPr>
-              <w:t>61.200</w:t>
-            </w:r>
-          </w:p>
-        </w:tc>
-        <w:tc>
-          <w:tcPr>
-            <w:tcW w:type="dxa" w:w="1758"/>
-          </w:tcPr>
-          <w:p>
-            <w:r>
-              <w:rPr>
-                <w:rFonts w:ascii="Calibri" w:hAnsi="Calibri"/>
-                <w:sz w:val="18"/>
-              </w:rPr>
-              <w:t>18,4</w:t>
-            </w:r>
-          </w:p>
-        </w:tc>
-        <w:tc>
-          <w:tcPr>
-            <w:tcW w:type="dxa" w:w="1758"/>
-          </w:tcPr>
-          <w:p>
-            <w:r>
-              <w:rPr>
-                <w:rFonts w:ascii="Calibri" w:hAnsi="Calibri"/>
-                <w:sz w:val="18"/>
-              </w:rPr>
-              <w:t>11.260,80</w:t>
+              <w:t>20.552,96 EUR</w:t>
             </w:r>
           </w:p>
         </w:tc>
@@ -1781,84 +1207,13 @@
       <w:tr>
         <w:tc>
           <w:tcPr>
-            <w:tcW w:type="dxa" w:w="1758"/>
+            <w:tcW w:type="dxa" w:w="3248"/>
+            <w:vAlign w:val="top"/>
           </w:tcPr>
           <w:p>
             <w:r>
               <w:rPr>
-                <w:rFonts w:ascii="Calibri" w:hAnsi="Calibri"/>
-                <w:sz w:val="18"/>
-              </w:rPr>
-              <w:t>M. Kordes</w:t>
-            </w:r>
-          </w:p>
-        </w:tc>
-        <w:tc>
-          <w:tcPr>
-            <w:tcW w:type="dxa" w:w="1758"/>
-          </w:tcPr>
-          <w:p>
-            <w:r>
-              <w:rPr>
-                <w:rFonts w:ascii="Calibri" w:hAnsi="Calibri"/>
-                <w:sz w:val="18"/>
-              </w:rPr>
-              <w:t>7.800</w:t>
-            </w:r>
-          </w:p>
-        </w:tc>
-        <w:tc>
-          <w:tcPr>
-            <w:tcW w:type="dxa" w:w="1758"/>
-          </w:tcPr>
-          <w:p>
-            <w:r>
-              <w:rPr>
-                <w:rFonts w:ascii="Calibri" w:hAnsi="Calibri"/>
-                <w:sz w:val="18"/>
-              </w:rPr>
-              <w:t>0</w:t>
-            </w:r>
-          </w:p>
-        </w:tc>
-        <w:tc>
-          <w:tcPr>
-            <w:tcW w:type="dxa" w:w="1758"/>
-          </w:tcPr>
-          <w:p>
-            <w:r>
-              <w:rPr>
-                <w:rFonts w:ascii="Calibri" w:hAnsi="Calibri"/>
-                <w:sz w:val="18"/>
-              </w:rPr>
-              <w:t>–</w:t>
-            </w:r>
-          </w:p>
-        </w:tc>
-        <w:tc>
-          <w:tcPr>
-            <w:tcW w:type="dxa" w:w="1758"/>
-          </w:tcPr>
-          <w:p>
-            <w:r>
-              <w:rPr>
-                <w:rFonts w:ascii="Calibri" w:hAnsi="Calibri"/>
-                <w:sz w:val="18"/>
-              </w:rPr>
-              <w:t>0,00</w:t>
-            </w:r>
-          </w:p>
-        </w:tc>
-      </w:tr>
-      <w:tr>
-        <w:tc>
-          <w:tcPr>
-            <w:tcW w:type="dxa" w:w="1758"/>
-          </w:tcPr>
-          <w:p>
-            <w:r>
-              <w:rPr>
-                <w:rFonts w:ascii="Calibri" w:hAnsi="Calibri"/>
+                <w:rFonts w:ascii="Times New Roman" w:hAnsi="Times New Roman"/>
                 <w:sz w:val="18"/>
               </w:rPr>
               <w:t>Prignitz Forst KG</w:t>
@@ -1867,57 +1222,31 @@
         </w:tc>
         <w:tc>
           <w:tcPr>
-            <w:tcW w:type="dxa" w:w="1758"/>
+            <w:tcW w:type="dxa" w:w="3248"/>
+            <w:vAlign w:val="top"/>
           </w:tcPr>
           <w:p>
             <w:r>
               <w:rPr>
-                <w:rFonts w:ascii="Calibri" w:hAnsi="Calibri"/>
+                <w:rFonts w:ascii="Times New Roman" w:hAnsi="Times New Roman"/>
                 <w:sz w:val="18"/>
               </w:rPr>
-              <w:t>43.700</w:t>
+              <w:t>43.700,00 EUR</w:t>
             </w:r>
           </w:p>
         </w:tc>
         <w:tc>
           <w:tcPr>
-            <w:tcW w:type="dxa" w:w="1758"/>
+            <w:tcW w:type="dxa" w:w="3248"/>
+            <w:vAlign w:val="top"/>
           </w:tcPr>
           <w:p>
             <w:r>
               <w:rPr>
-                <w:rFonts w:ascii="Calibri" w:hAnsi="Calibri"/>
+                <w:rFonts w:ascii="Times New Roman" w:hAnsi="Times New Roman"/>
                 <w:sz w:val="18"/>
               </w:rPr>
-              <w:t>43.700</w:t>
-            </w:r>
-          </w:p>
-        </w:tc>
-        <w:tc>
-          <w:tcPr>
-            <w:tcW w:type="dxa" w:w="1758"/>
-          </w:tcPr>
-          <w:p>
-            <w:r>
-              <w:rPr>
-                <w:rFonts w:ascii="Calibri" w:hAnsi="Calibri"/>
-                <w:sz w:val="18"/>
-              </w:rPr>
-              <w:t>18,4</w:t>
-            </w:r>
-          </w:p>
-        </w:tc>
-        <w:tc>
-          <w:tcPr>
-            <w:tcW w:type="dxa" w:w="1758"/>
-          </w:tcPr>
-          <w:p>
-            <w:r>
-              <w:rPr>
-                <w:rFonts w:ascii="Calibri" w:hAnsi="Calibri"/>
-                <w:sz w:val="18"/>
-              </w:rPr>
-              <w:t>8.040,80</w:t>
+              <w:t>14.675,89 EUR</w:t>
             </w:r>
           </w:p>
         </w:tc>
@@ -1925,12 +1254,13 @@
       <w:tr>
         <w:tc>
           <w:tcPr>
-            <w:tcW w:type="dxa" w:w="1758"/>
+            <w:tcW w:type="dxa" w:w="3248"/>
+            <w:vAlign w:val="top"/>
           </w:tcPr>
           <w:p>
             <w:r>
               <w:rPr>
-                <w:rFonts w:ascii="Calibri" w:hAnsi="Calibri"/>
+                <w:rFonts w:ascii="Times New Roman" w:hAnsi="Times New Roman"/>
                 <w:sz w:val="18"/>
               </w:rPr>
               <w:t>Holzbauer GmbH &amp; Co. KG</w:t>
@@ -1939,57 +1269,31 @@
         </w:tc>
         <w:tc>
           <w:tcPr>
-            <w:tcW w:type="dxa" w:w="1758"/>
+            <w:tcW w:type="dxa" w:w="3248"/>
+            <w:vAlign w:val="top"/>
           </w:tcPr>
           <w:p>
             <w:r>
               <w:rPr>
-                <w:rFonts w:ascii="Calibri" w:hAnsi="Calibri"/>
+                <w:rFonts w:ascii="Times New Roman" w:hAnsi="Times New Roman"/>
                 <w:sz w:val="18"/>
               </w:rPr>
-              <w:t>28.100</w:t>
+              <w:t>28.100,00 EUR</w:t>
             </w:r>
           </w:p>
         </w:tc>
         <w:tc>
           <w:tcPr>
-            <w:tcW w:type="dxa" w:w="1758"/>
+            <w:tcW w:type="dxa" w:w="3248"/>
+            <w:vAlign w:val="top"/>
           </w:tcPr>
           <w:p>
             <w:r>
               <w:rPr>
-                <w:rFonts w:ascii="Calibri" w:hAnsi="Calibri"/>
+                <w:rFonts w:ascii="Times New Roman" w:hAnsi="Times New Roman"/>
                 <w:sz w:val="18"/>
               </w:rPr>
-              <w:t>28.100</w:t>
-            </w:r>
-          </w:p>
-        </w:tc>
-        <w:tc>
-          <w:tcPr>
-            <w:tcW w:type="dxa" w:w="1758"/>
-          </w:tcPr>
-          <w:p>
-            <w:r>
-              <w:rPr>
-                <w:rFonts w:ascii="Calibri" w:hAnsi="Calibri"/>
-                <w:sz w:val="18"/>
-              </w:rPr>
-              <w:t>18,4</w:t>
-            </w:r>
-          </w:p>
-        </w:tc>
-        <w:tc>
-          <w:tcPr>
-            <w:tcW w:type="dxa" w:w="1758"/>
-          </w:tcPr>
-          <w:p>
-            <w:r>
-              <w:rPr>
-                <w:rFonts w:ascii="Calibri" w:hAnsi="Calibri"/>
-                <w:sz w:val="18"/>
-              </w:rPr>
-              <w:t>5.170,40</w:t>
+              <w:t>9.436,90 EUR</w:t>
             </w:r>
           </w:p>
         </w:tc>
@@ -1997,12 +1301,13 @@
       <w:tr>
         <w:tc>
           <w:tcPr>
-            <w:tcW w:type="dxa" w:w="1758"/>
+            <w:tcW w:type="dxa" w:w="3248"/>
+            <w:vAlign w:val="top"/>
           </w:tcPr>
           <w:p>
             <w:r>
               <w:rPr>
-                <w:rFonts w:ascii="Calibri" w:hAnsi="Calibri"/>
+                <w:rFonts w:ascii="Times New Roman" w:hAnsi="Times New Roman"/>
                 <w:sz w:val="18"/>
               </w:rPr>
               <w:t>Beschlagwerk Elbe AG</w:t>
@@ -2011,57 +1316,31 @@
         </w:tc>
         <w:tc>
           <w:tcPr>
-            <w:tcW w:type="dxa" w:w="1758"/>
+            <w:tcW w:type="dxa" w:w="3248"/>
+            <w:vAlign w:val="top"/>
           </w:tcPr>
           <w:p>
             <w:r>
               <w:rPr>
-                <w:rFonts w:ascii="Calibri" w:hAnsi="Calibri"/>
+                <w:rFonts w:ascii="Times New Roman" w:hAnsi="Times New Roman"/>
                 <w:sz w:val="18"/>
               </w:rPr>
-              <w:t>19.440</w:t>
+              <w:t>19.440,00 EUR</w:t>
             </w:r>
           </w:p>
         </w:tc>
         <w:tc>
           <w:tcPr>
-            <w:tcW w:type="dxa" w:w="1758"/>
+            <w:tcW w:type="dxa" w:w="3248"/>
+            <w:vAlign w:val="top"/>
           </w:tcPr>
           <w:p>
             <w:r>
               <w:rPr>
-                <w:rFonts w:ascii="Calibri" w:hAnsi="Calibri"/>
+                <w:rFonts w:ascii="Times New Roman" w:hAnsi="Times New Roman"/>
                 <w:sz w:val="18"/>
               </w:rPr>
-              <w:t>19.440</w:t>
-            </w:r>
-          </w:p>
-        </w:tc>
-        <w:tc>
-          <w:tcPr>
-            <w:tcW w:type="dxa" w:w="1758"/>
-          </w:tcPr>
-          <w:p>
-            <w:r>
-              <w:rPr>
-                <w:rFonts w:ascii="Calibri" w:hAnsi="Calibri"/>
-                <w:sz w:val="18"/>
-              </w:rPr>
-              <w:t>18,4</w:t>
-            </w:r>
-          </w:p>
-        </w:tc>
-        <w:tc>
-          <w:tcPr>
-            <w:tcW w:type="dxa" w:w="1758"/>
-          </w:tcPr>
-          <w:p>
-            <w:r>
-              <w:rPr>
-                <w:rFonts w:ascii="Calibri" w:hAnsi="Calibri"/>
-                <w:sz w:val="18"/>
-              </w:rPr>
-              <w:t>3.576,96</w:t>
+              <w:t>6.528,58 EUR</w:t>
             </w:r>
           </w:p>
         </w:tc>
@@ -2069,12 +1348,13 @@
       <w:tr>
         <w:tc>
           <w:tcPr>
-            <w:tcW w:type="dxa" w:w="1758"/>
+            <w:tcW w:type="dxa" w:w="3248"/>
+            <w:vAlign w:val="top"/>
           </w:tcPr>
           <w:p>
             <w:r>
               <w:rPr>
-                <w:rFonts w:ascii="Calibri" w:hAnsi="Calibri"/>
+                <w:rFonts w:ascii="Times New Roman" w:hAnsi="Times New Roman"/>
                 <w:sz w:val="18"/>
               </w:rPr>
               <w:t>Havelstrom GbR</w:t>
@@ -2083,57 +1363,31 @@
         </w:tc>
         <w:tc>
           <w:tcPr>
-            <w:tcW w:type="dxa" w:w="1758"/>
+            <w:tcW w:type="dxa" w:w="3248"/>
+            <w:vAlign w:val="top"/>
           </w:tcPr>
           <w:p>
             <w:r>
               <w:rPr>
-                <w:rFonts w:ascii="Calibri" w:hAnsi="Calibri"/>
+                <w:rFonts w:ascii="Times New Roman" w:hAnsi="Times New Roman"/>
                 <w:sz w:val="18"/>
               </w:rPr>
-              <w:t>48.000</w:t>
+              <w:t>48.000,00 EUR</w:t>
             </w:r>
           </w:p>
         </w:tc>
         <w:tc>
           <w:tcPr>
-            <w:tcW w:type="dxa" w:w="1758"/>
+            <w:tcW w:type="dxa" w:w="3248"/>
+            <w:vAlign w:val="top"/>
           </w:tcPr>
           <w:p>
             <w:r>
               <w:rPr>
-                <w:rFonts w:ascii="Calibri" w:hAnsi="Calibri"/>
+                <w:rFonts w:ascii="Times New Roman" w:hAnsi="Times New Roman"/>
                 <w:sz w:val="18"/>
               </w:rPr>
-              <w:t>48.000</w:t>
-            </w:r>
-          </w:p>
-        </w:tc>
-        <w:tc>
-          <w:tcPr>
-            <w:tcW w:type="dxa" w:w="1758"/>
-          </w:tcPr>
-          <w:p>
-            <w:r>
-              <w:rPr>
-                <w:rFonts w:ascii="Calibri" w:hAnsi="Calibri"/>
-                <w:sz w:val="18"/>
-              </w:rPr>
-              <w:t>18,4</w:t>
-            </w:r>
-          </w:p>
-        </w:tc>
-        <w:tc>
-          <w:tcPr>
-            <w:tcW w:type="dxa" w:w="1758"/>
-          </w:tcPr>
-          <w:p>
-            <w:r>
-              <w:rPr>
-                <w:rFonts w:ascii="Calibri" w:hAnsi="Calibri"/>
-                <w:sz w:val="18"/>
-              </w:rPr>
-              <w:t>8.832,00</w:t>
+              <w:t>16.119,97 EUR</w:t>
             </w:r>
           </w:p>
         </w:tc>
@@ -2141,71 +1395,46 @@
       <w:tr>
         <w:tc>
           <w:tcPr>
-            <w:tcW w:type="dxa" w:w="1758"/>
+            <w:tcW w:type="dxa" w:w="3248"/>
+            <w:vAlign w:val="top"/>
           </w:tcPr>
           <w:p>
             <w:r>
               <w:rPr>
-                <w:rFonts w:ascii="Calibri" w:hAnsi="Calibri"/>
+                <w:rFonts w:ascii="Times New Roman" w:hAnsi="Times New Roman"/>
                 <w:sz w:val="18"/>
               </w:rPr>
-              <w:t>Arbeitnehmer (38 Personen)</w:t>
+              <w:t>Arbeitnehmerforderungen</w:t>
             </w:r>
           </w:p>
         </w:tc>
         <w:tc>
           <w:tcPr>
-            <w:tcW w:type="dxa" w:w="1758"/>
+            <w:tcW w:type="dxa" w:w="3248"/>
+            <w:vAlign w:val="top"/>
           </w:tcPr>
           <w:p>
             <w:r>
               <w:rPr>
-                <w:rFonts w:ascii="Calibri" w:hAnsi="Calibri"/>
+                <w:rFonts w:ascii="Times New Roman" w:hAnsi="Times New Roman"/>
                 <w:sz w:val="18"/>
               </w:rPr>
-              <w:t>236.000</w:t>
+              <w:t>236.000,00 EUR</w:t>
             </w:r>
           </w:p>
         </w:tc>
         <w:tc>
           <w:tcPr>
-            <w:tcW w:type="dxa" w:w="1758"/>
+            <w:tcW w:type="dxa" w:w="3248"/>
+            <w:vAlign w:val="top"/>
           </w:tcPr>
           <w:p>
             <w:r>
               <w:rPr>
-                <w:rFonts w:ascii="Calibri" w:hAnsi="Calibri"/>
+                <w:rFonts w:ascii="Times New Roman" w:hAnsi="Times New Roman"/>
                 <w:sz w:val="18"/>
               </w:rPr>
-              <w:t>236.000</w:t>
-            </w:r>
-          </w:p>
-        </w:tc>
-        <w:tc>
-          <w:tcPr>
-            <w:tcW w:type="dxa" w:w="1758"/>
-          </w:tcPr>
-          <w:p>
-            <w:r>
-              <w:rPr>
-                <w:rFonts w:ascii="Calibri" w:hAnsi="Calibri"/>
-                <w:sz w:val="18"/>
-              </w:rPr>
-              <w:t>18,4</w:t>
-            </w:r>
-          </w:p>
-        </w:tc>
-        <w:tc>
-          <w:tcPr>
-            <w:tcW w:type="dxa" w:w="1758"/>
-          </w:tcPr>
-          <w:p>
-            <w:r>
-              <w:rPr>
-                <w:rFonts w:ascii="Calibri" w:hAnsi="Calibri"/>
-                <w:sz w:val="18"/>
-              </w:rPr>
-              <w:t>43.424,00</w:t>
+              <w:t>79.256,51 EUR</w:t>
             </w:r>
           </w:p>
         </w:tc>
@@ -2213,12 +1442,13 @@
       <w:tr>
         <w:tc>
           <w:tcPr>
-            <w:tcW w:type="dxa" w:w="1758"/>
+            <w:tcW w:type="dxa" w:w="3248"/>
+            <w:vAlign w:val="top"/>
           </w:tcPr>
           <w:p>
             <w:r>
               <w:rPr>
-                <w:rFonts w:ascii="Calibri" w:hAnsi="Calibri"/>
+                <w:rFonts w:ascii="Times New Roman" w:hAnsi="Times New Roman"/>
                 <w:sz w:val="18"/>
               </w:rPr>
               <w:t>Würtl-Leasing GmbH</w:t>
@@ -2227,57 +1457,31 @@
         </w:tc>
         <w:tc>
           <w:tcPr>
-            <w:tcW w:type="dxa" w:w="1758"/>
+            <w:tcW w:type="dxa" w:w="3248"/>
+            <w:vAlign w:val="top"/>
           </w:tcPr>
           <w:p>
             <w:r>
               <w:rPr>
-                <w:rFonts w:ascii="Calibri" w:hAnsi="Calibri"/>
+                <w:rFonts w:ascii="Times New Roman" w:hAnsi="Times New Roman"/>
                 <w:sz w:val="18"/>
               </w:rPr>
-              <w:t>22.800</w:t>
+              <w:t>11.200,00 EUR</w:t>
             </w:r>
           </w:p>
         </w:tc>
         <w:tc>
           <w:tcPr>
-            <w:tcW w:type="dxa" w:w="1758"/>
+            <w:tcW w:type="dxa" w:w="3248"/>
+            <w:vAlign w:val="top"/>
           </w:tcPr>
           <w:p>
             <w:r>
               <w:rPr>
-                <w:rFonts w:ascii="Calibri" w:hAnsi="Calibri"/>
+                <w:rFonts w:ascii="Times New Roman" w:hAnsi="Times New Roman"/>
                 <w:sz w:val="18"/>
               </w:rPr>
-              <w:t>11.200</w:t>
-            </w:r>
-          </w:p>
-        </w:tc>
-        <w:tc>
-          <w:tcPr>
-            <w:tcW w:type="dxa" w:w="1758"/>
-          </w:tcPr>
-          <w:p>
-            <w:r>
-              <w:rPr>
-                <w:rFonts w:ascii="Calibri" w:hAnsi="Calibri"/>
-                <w:sz w:val="18"/>
-              </w:rPr>
-              <w:t>18,4</w:t>
-            </w:r>
-          </w:p>
-        </w:tc>
-        <w:tc>
-          <w:tcPr>
-            <w:tcW w:type="dxa" w:w="1758"/>
-          </w:tcPr>
-          <w:p>
-            <w:r>
-              <w:rPr>
-                <w:rFonts w:ascii="Calibri" w:hAnsi="Calibri"/>
-                <w:sz w:val="18"/>
-              </w:rPr>
-              <w:t>2.060,80</w:t>
+              <w:t>3.761,32 EUR</w:t>
             </w:r>
           </w:p>
         </w:tc>
@@ -2285,225 +1489,126 @@
       <w:tr>
         <w:tc>
           <w:tcPr>
-            <w:tcW w:type="dxa" w:w="1758"/>
+            <w:tcW w:type="dxa" w:w="3248"/>
+            <w:vAlign w:val="top"/>
           </w:tcPr>
           <w:p>
             <w:r>
               <w:rPr>
-                <w:rFonts w:ascii="Calibri" w:hAnsi="Calibri"/>
+                <w:rFonts w:ascii="Times New Roman" w:hAnsi="Times New Roman"/>
                 <w:sz w:val="18"/>
               </w:rPr>
-              <w:t>Tim Brauer (nachrangig § 39)</w:t>
+              <w:t>Summe</w:t>
             </w:r>
           </w:p>
         </w:tc>
         <w:tc>
           <w:tcPr>
-            <w:tcW w:type="dxa" w:w="1758"/>
+            <w:tcW w:type="dxa" w:w="3248"/>
+            <w:vAlign w:val="top"/>
           </w:tcPr>
           <w:p>
             <w:r>
               <w:rPr>
-                <w:rFonts w:ascii="Calibri" w:hAnsi="Calibri"/>
+                <w:rFonts w:ascii="Times New Roman" w:hAnsi="Times New Roman"/>
                 <w:sz w:val="18"/>
               </w:rPr>
-              <w:t>120.000</w:t>
+              <w:t>862.900,00 EUR</w:t>
             </w:r>
           </w:p>
         </w:tc>
         <w:tc>
           <w:tcPr>
-            <w:tcW w:type="dxa" w:w="1758"/>
+            <w:tcW w:type="dxa" w:w="3248"/>
+            <w:vAlign w:val="top"/>
           </w:tcPr>
           <w:p>
             <w:r>
               <w:rPr>
-                <w:rFonts w:ascii="Calibri" w:hAnsi="Calibri"/>
+                <w:rFonts w:ascii="Times New Roman" w:hAnsi="Times New Roman"/>
                 <w:sz w:val="18"/>
               </w:rPr>
-              <w:t>120.000</w:t>
-            </w:r>
-          </w:p>
-        </w:tc>
-        <w:tc>
-          <w:tcPr>
-            <w:tcW w:type="dxa" w:w="1758"/>
-          </w:tcPr>
-          <w:p>
-            <w:r>
-              <w:rPr>
-                <w:rFonts w:ascii="Calibri" w:hAnsi="Calibri"/>
-                <w:sz w:val="18"/>
-              </w:rPr>
-              <w:t>0</w:t>
-            </w:r>
-          </w:p>
-        </w:tc>
-        <w:tc>
-          <w:tcPr>
-            <w:tcW w:type="dxa" w:w="1758"/>
-          </w:tcPr>
-          <w:p>
-            <w:r>
-              <w:rPr>
-                <w:rFonts w:ascii="Calibri" w:hAnsi="Calibri"/>
-                <w:sz w:val="18"/>
-              </w:rPr>
-              <w:t>0,00</w:t>
+              <w:t>289.790,00 EUR</w:t>
             </w:r>
           </w:p>
         </w:tc>
       </w:tr>
     </w:tbl>
+    <w:p/>
     <w:p>
       <w:pPr>
-        <w:spacing w:line="259" w:lineRule="auto" w:after="60"/>
-      </w:pPr>
-    </w:p>
-    <w:p>
-      <w:pPr>
-        <w:spacing w:line="259" w:lineRule="auto" w:after="60"/>
-        <w:jc w:val="left"/>
+        <w:spacing w:after="120"/>
       </w:pPr>
       <w:r>
-        <w:rPr>
-          <w:rFonts w:ascii="Calibri" w:hAnsi="Calibri"/>
-          <w:b/>
-          <w:sz w:val="24"/>
-        </w:rPr>
-        <w:t>IV. Abschlusserklärung</w:t>
+        <w:t>Die ungerundete Quote beträgt 33,583266 Prozent. Die Auszahlungen werden auf Cent abgerundet; sieben Restcent werden nach den größten Bruchteilsresten zugeteilt. Eine pauschale Reserve von 130.012,68 EUR wird nicht gebildet, weil dafür weder eine offene Masseverbindlichkeit noch ein anderer konkreter Rechtsgrund belegt ist.</w:t>
       </w:r>
     </w:p>
     <w:p>
       <w:pPr>
-        <w:spacing w:line="259" w:lineRule="auto" w:after="60"/>
-        <w:jc w:val="both"/>
+        <w:pStyle w:val="Heading1"/>
       </w:pPr>
       <w:r>
-        <w:rPr>
-          <w:rFonts w:ascii="Calibri" w:hAnsi="Calibri"/>
-          <w:b w:val="0"/>
-          <w:sz w:val="22"/>
-        </w:rPr>
-        <w:t>Die Insolvenzverwalterin erklärt, dass die Schlussrechnung vollständig und nach bestem Wissen erstellt ist. Sämtliche Einnahmen und Ausgaben sind durch Belege dokumentiert. Die Möbelwerk Havelberg GmbH ist nach Aufhebung des Verfahrens von Amts wegen aufgelöst. Die Löschung aus dem Handelsregister wurde beantragt. Eine Nachtragsverteilung aus ausstehenden Steuerveranlagungen wird nach Bestandskraft der Bescheide gesondert beantragt.</w:t>
+        <w:t>6. Offene Restvorgänge und Nachtragsverteilung</w:t>
       </w:r>
     </w:p>
     <w:p>
       <w:pPr>
-        <w:spacing w:line="259" w:lineRule="auto" w:after="60"/>
-      </w:pPr>
-    </w:p>
-    <w:p>
-      <w:pPr>
-        <w:spacing w:line="259" w:lineRule="auto" w:after="60"/>
-        <w:jc w:val="both"/>
+        <w:spacing w:after="120"/>
       </w:pPr>
       <w:r>
-        <w:rPr>
-          <w:rFonts w:ascii="Calibri" w:hAnsi="Calibri"/>
-          <w:b w:val="0"/>
-          <w:sz w:val="22"/>
-        </w:rPr>
-        <w:t>Mit freundlichen Grüßen</w:t>
+        <w:t>Die Veranlagungen sind nach dem Aktenstand abgeschlossen. Ein lediglich möglicher künftiger Steuer- oder Versicherungszufluss wird nicht als vorhandene Masse gebucht und rechtfertigt keinen pauschalen Rückbehalt. Sollte nach der Aufhebung ein weiterer Massegegenstand ermittelt oder ein bereits ausgekehrter Betrag zurückfließen, werden Massezugehörigkeit und die Voraussetzungen der §§ 203 bis 205 InsO gesondert geprüft.</w:t>
       </w:r>
     </w:p>
     <w:p>
       <w:pPr>
-        <w:spacing w:line="259" w:lineRule="auto" w:after="60"/>
-      </w:pPr>
-    </w:p>
-    <w:p>
-      <w:pPr>
-        <w:spacing w:line="259" w:lineRule="auto" w:after="60"/>
-        <w:jc w:val="both"/>
+        <w:pStyle w:val="Heading1"/>
       </w:pPr>
       <w:r>
-        <w:rPr>
-          <w:rFonts w:ascii="Calibri" w:hAnsi="Calibri"/>
-          <w:b w:val="0"/>
-          <w:sz w:val="22"/>
-        </w:rPr>
-        <w:t>_____________________________</w:t>
+        <w:t>7. Abschlussreife</w:t>
       </w:r>
     </w:p>
     <w:p>
       <w:pPr>
-        <w:spacing w:line="259" w:lineRule="auto" w:after="60"/>
-        <w:jc w:val="both"/>
+        <w:spacing w:after="120"/>
       </w:pPr>
       <w:r>
-        <w:rPr>
-          <w:rFonts w:ascii="Calibri" w:hAnsi="Calibri"/>
-          <w:b/>
-          <w:sz w:val="22"/>
-        </w:rPr>
-        <w:t>Dr. Nora Westphal</w:t>
+        <w:t>Die bekannten verwertbaren Massegegenstände sind realisiert. Die Konten stimmen mit der Schlussrechnung überein. Die Forderungsbasis ist mit der Tabelle abgeglichen. Die Abschlussreife wird daher bejaht. Der Bundesgerichtshof hat mit Beschluss vom 11. November 2021, IX ZB 19/20, Randnummern 12 und 14 bis 21, für die dortige Vergütungsfrage hervorgehoben, dass eine bloße Schlussrechnung oder ein Schlusstermin bei fortdauernder Verwertung keinen Abschluss ersetzt. Hier sind nach dem belegten Aktenstand keine weiteren Verwertungsschritte offen; die Entscheidung wird nicht als allgemeine Freigabefiktion verwendet.</w:t>
       </w:r>
     </w:p>
     <w:p>
       <w:pPr>
-        <w:spacing w:line="259" w:lineRule="auto" w:after="60"/>
-        <w:jc w:val="both"/>
+        <w:pStyle w:val="Heading1"/>
       </w:pPr>
       <w:r>
-        <w:rPr>
-          <w:rFonts w:ascii="Calibri" w:hAnsi="Calibri"/>
-          <w:b w:val="0"/>
-          <w:sz w:val="22"/>
-        </w:rPr>
-        <w:t>Insolvenzverwalterin</w:t>
+        <w:t>8. Anträge und Freigabegrenze</w:t>
+      </w:r>
+    </w:p>
+    <w:p>
+      <w:pPr>
+        <w:spacing w:after="120"/>
+      </w:pPr>
+      <w:r>
+        <w:t>Es wird beantragt, die Schlussrechnung zu prüfen, der Schlussverteilung nach § 196 Absatz 2 InsO zuzustimmen und den Schlusstermin nach § 197 InsO zu bestimmen. Der Bericht bestätigt keine noch nicht ausgeführte Zahlung. Einreichung, Zahlung und Schlussmitteilung bedürfen jeweils einer gesondert dokumentierten menschlichen Freigabe.</w:t>
+      </w:r>
+    </w:p>
+    <w:p>
+      <w:pPr>
+        <w:spacing w:after="120"/>
+      </w:pPr>
+      <w:r>
+        <w:t>Dr. Nora Westphal</w:t>
+        <w:br/>
+        <w:t>Rechtsanwältin und Insolvenzverwalterin</w:t>
       </w:r>
     </w:p>
     <w:sectPr>
-      <w:headerReference w:type="default" r:id="rId9"/>
-      <w:footerReference w:type="default" r:id="rId10"/>
-      <w:pgSz w:w="11906" w:h="16838"/>
-      <w:pgMar w:top="1191" w:right="1247" w:bottom="1134" w:left="1361" w:header="720" w:footer="720" w:gutter="0"/>
+      <w:pgSz w:w="12240" w:h="15840"/>
+      <w:pgMar w:top="1191" w:right="1191" w:bottom="1134" w:left="1304" w:header="720" w:footer="720" w:gutter="0"/>
       <w:cols w:space="720"/>
       <w:docGrid w:linePitch="360"/>
     </w:sectPr>
   </w:body>
 </w:document>
-</file>
-
-<file path=word/footer1.xml><?xml version="1.0" encoding="utf-8"?>
-<w:ftr xmlns:m="http://schemas.openxmlformats.org/officeDocument/2006/math" xmlns:mc="http://schemas.openxmlformats.org/markup-compatibility/2006" xmlns:mo="http://schemas.microsoft.com/office/mac/office/2008/main" xmlns:mv="urn:schemas-microsoft-com:mac:vml" xmlns:o="urn:schemas-microsoft-com:office:office" xmlns:r="http://schemas.openxmlformats.org/officeDocument/2006/relationships" xmlns:v="urn:schemas-microsoft-com:vml" xmlns:w10="urn:schemas-microsoft-com:office:word" xmlns:w14="http://schemas.microsoft.com/office/word/2010/wordml" xmlns:w="http://schemas.openxmlformats.org/wordprocessingml/2006/main" xmlns:wne="http://schemas.microsoft.com/office/word/2006/wordml" xmlns:wp14="http://schemas.microsoft.com/office/word/2010/wordprocessingDrawing" xmlns:wp="http://schemas.openxmlformats.org/drawingml/2006/wordprocessingDrawing" xmlns:wpc="http://schemas.microsoft.com/office/word/2010/wordprocessingCanvas" xmlns:wpg="http://schemas.microsoft.com/office/word/2010/wordprocessingGroup" xmlns:wpi="http://schemas.microsoft.com/office/word/2010/wordprocessingInk" xmlns:wps="http://schemas.microsoft.com/office/word/2010/wordprocessingShape" mc:Ignorable="w14 wp14">
-  <w:p>
-    <w:pPr>
-      <w:pStyle w:val="Footer"/>
-      <w:jc w:val="left"/>
-    </w:pPr>
-    <w:r/>
-    <w:r>
-      <w:rPr>
-        <w:rFonts w:ascii="Times New Roman" w:hAnsi="Times New Roman"/>
-        <w:b w:val="0"/>
-        <w:color w:val="777777"/>
-        <w:sz w:val="17"/>
-      </w:rPr>
-      <w:t>Vertraulich | Bearbeitungsstand Juli 2026 | nur zur Aktenbearbeitung</w:t>
-    </w:r>
-  </w:p>
-</w:ftr>
-</file>
-
-<file path=word/header1.xml><?xml version="1.0" encoding="utf-8"?>
-<w:hdr xmlns:m="http://schemas.openxmlformats.org/officeDocument/2006/math" xmlns:mc="http://schemas.openxmlformats.org/markup-compatibility/2006" xmlns:mo="http://schemas.microsoft.com/office/mac/office/2008/main" xmlns:mv="urn:schemas-microsoft-com:mac:vml" xmlns:o="urn:schemas-microsoft-com:office:office" xmlns:r="http://schemas.openxmlformats.org/officeDocument/2006/relationships" xmlns:v="urn:schemas-microsoft-com:vml" xmlns:w10="urn:schemas-microsoft-com:office:word" xmlns:w14="http://schemas.microsoft.com/office/word/2010/wordml" xmlns:w="http://schemas.openxmlformats.org/wordprocessingml/2006/main" xmlns:wne="http://schemas.microsoft.com/office/word/2006/wordml" xmlns:wp14="http://schemas.microsoft.com/office/word/2010/wordprocessingDrawing" xmlns:wp="http://schemas.openxmlformats.org/drawingml/2006/wordprocessingDrawing" xmlns:wpc="http://schemas.microsoft.com/office/word/2010/wordprocessingCanvas" xmlns:wpg="http://schemas.microsoft.com/office/word/2010/wordprocessingGroup" xmlns:wpi="http://schemas.microsoft.com/office/word/2010/wordprocessingInk" xmlns:wps="http://schemas.microsoft.com/office/word/2010/wordprocessingShape" mc:Ignorable="w14 wp14">
-  <w:p>
-    <w:pPr>
-      <w:pStyle w:val="Header"/>
-      <w:jc w:val="right"/>
-    </w:pPr>
-    <w:r>
-      <w:rPr>
-        <w:rFonts w:ascii="Calibri" w:hAnsi="Calibri"/>
-        <w:color w:val="787878"/>
-        <w:sz w:val="18"/>
-      </w:rPr>
-      <w:t>Az. 7 IN 41/26 | Schlussbericht</w:t>
-    </w:r>
-  </w:p>
-</w:hdr>
 </file>
 
 <file path=word/numbering.xml><?xml version="1.0" encoding="utf-8"?>
@@ -2870,7 +1975,7 @@
     <w:qFormat/>
     <w:rsid w:val="00FC693F"/>
     <w:rPr>
-      <w:rFonts w:ascii="Times New Roman" w:hAnsi="Times New Roman"/>
+      <w:rFonts w:ascii="Times New Roman" w:hAnsi="Times New Roman" w:eastAsia="Times New Roman"/>
       <w:sz w:val="22"/>
     </w:rPr>
   </w:style>
@@ -2933,10 +2038,9 @@
       <w:outlineLvl w:val="0"/>
     </w:pPr>
     <w:rPr>
-      <w:rFonts w:asciiTheme="majorHAnsi" w:eastAsiaTheme="majorEastAsia" w:hAnsiTheme="majorHAnsi" w:cstheme="majorBidi" w:ascii="Times New Roman" w:hAnsi="Times New Roman"/>
+      <w:rFonts w:asciiTheme="majorHAnsi" w:eastAsiaTheme="majorEastAsia" w:hAnsiTheme="majorHAnsi" w:cstheme="majorBidi" w:ascii="Times New Roman" w:hAnsi="Times New Roman" w:eastAsia="Times New Roman"/>
       <w:b/>
       <w:bCs/>
-      <w:color w:val="365F91" w:themeColor="accent1" w:themeShade="BF"/>
       <w:sz w:val="28"/>
       <w:szCs w:val="28"/>
     </w:rPr>
@@ -2957,10 +2061,9 @@
       <w:outlineLvl w:val="1"/>
     </w:pPr>
     <w:rPr>
-      <w:rFonts w:asciiTheme="majorHAnsi" w:eastAsiaTheme="majorEastAsia" w:hAnsiTheme="majorHAnsi" w:cstheme="majorBidi" w:ascii="Times New Roman" w:hAnsi="Times New Roman"/>
+      <w:rFonts w:asciiTheme="majorHAnsi" w:eastAsiaTheme="majorEastAsia" w:hAnsiTheme="majorHAnsi" w:cstheme="majorBidi" w:ascii="Times New Roman" w:hAnsi="Times New Roman" w:eastAsia="Times New Roman"/>
       <w:b/>
       <w:bCs/>
-      <w:color w:val="4F81BD" w:themeColor="accent1"/>
       <w:sz w:val="24"/>
       <w:szCs w:val="26"/>
     </w:rPr>
@@ -2981,10 +2084,10 @@
       <w:outlineLvl w:val="2"/>
     </w:pPr>
     <w:rPr>
-      <w:rFonts w:asciiTheme="majorHAnsi" w:eastAsiaTheme="majorEastAsia" w:hAnsiTheme="majorHAnsi" w:cstheme="majorBidi"/>
+      <w:rFonts w:asciiTheme="majorHAnsi" w:eastAsiaTheme="majorEastAsia" w:hAnsiTheme="majorHAnsi" w:cstheme="majorBidi" w:ascii="Times New Roman" w:hAnsi="Times New Roman" w:eastAsia="Times New Roman"/>
       <w:b/>
       <w:bCs/>
-      <w:color w:val="4F81BD" w:themeColor="accent1"/>
+      <w:sz w:val="22"/>
     </w:rPr>
   </w:style>
   <w:style w:type="paragraph" w:styleId="Heading4">
@@ -3222,12 +2325,11 @@
       <w:contextualSpacing/>
     </w:pPr>
     <w:rPr>
-      <w:rFonts w:asciiTheme="majorHAnsi" w:eastAsiaTheme="majorEastAsia" w:hAnsiTheme="majorHAnsi" w:cstheme="majorBidi" w:ascii="Times New Roman" w:hAnsi="Times New Roman"/>
+      <w:rFonts w:asciiTheme="majorHAnsi" w:eastAsiaTheme="majorEastAsia" w:hAnsiTheme="majorHAnsi" w:cstheme="majorBidi" w:ascii="Times New Roman" w:hAnsi="Times New Roman" w:eastAsia="Times New Roman"/>
       <w:b/>
-      <w:color w:val="17365D" w:themeColor="text2" w:themeShade="BF"/>
       <w:spacing w:val="5"/>
       <w:kern w:val="28"/>
-      <w:sz w:val="30"/>
+      <w:sz w:val="32"/>
       <w:szCs w:val="52"/>
     </w:rPr>
   </w:style>

</xml_diff>